<commit_message>
cập nhật tài liệu
</commit_message>
<xml_diff>
--- a/docs/tai-lieu-du-thi/AI_ExamGuard_Tai_lieu_phan_cai_tien_theo_gop_y.docx
+++ b/docs/tai-lieu-du-thi/AI_ExamGuard_Tai_lieu_phan_cai_tien_theo_gop_y.docx
@@ -361,7 +361,7 @@
           <w:b w:val="0"/>
           <w:color w:val="1F2937"/>
         </w:rPr>
-        <w:t xml:space="preserve">Đọc lần lượt mục 3 → 6 → 7 → 8 (từng cải tiến + gỡ âm thanh + đường dự phòng). </w:t>
+        <w:t xml:space="preserve">Đọc lần lượt mục 3 → 8 (từng cải tiến + vận hành sau triển khai + gỡ âm thanh + đường dự phòng). </w:t>
       </w:r>
       <w:r>
         <w:rPr>
@@ -392,7 +392,7 @@
           <w:b w:val="0"/>
           <w:color w:val="1F2937"/>
         </w:rPr>
-        <w:t xml:space="preserve">Đọc mục 9 (bản đồ file) + mục 11 (câu hỏi khó) — mỗi bạn luyện nói to </w:t>
+        <w:t xml:space="preserve">Đọc mục 10 (bản đồ file) + mục 12 (câu hỏi khó) — mỗi bạn luyện nói to </w:t>
       </w:r>
       <w:r>
         <w:rPr>
@@ -431,7 +431,7 @@
           <w:b w:val="0"/>
           <w:color w:val="1F2937"/>
         </w:rPr>
-        <w:t>Chạy thử demo mục 10 trên máy thật ít nhất một lần, để ai cũng biết thao tác.</w:t>
+        <w:t>Chạy thử demo mục 11 trên máy thật ít nhất một lần, để ai cũng biết thao tác.</w:t>
       </w:r>
     </w:p>
     <w:p>
@@ -807,7 +807,7 @@
                 <w:color w:val="1F2937"/>
                 <w:sz w:val="18"/>
               </w:rPr>
-              <w:t>Clip tạo lúc AI cảnh báo (không lúc bấm xác nhận); RAM; mặc định tắt; biên bản chỉ confirmed.</w:t>
+              <w:t>Clip tạo lúc AI cảnh báo (không lúc bấm xác nhận); RAM; mặc định tắt; biên bản gồm cả Xác nhận đúng và Báo nhầm.</w:t>
             </w:r>
           </w:p>
         </w:tc>
@@ -872,7 +872,7 @@
                 <w:color w:val="1F2937"/>
                 <w:sz w:val="18"/>
               </w:rPr>
-              <w:t>Buổi thử thầy cô</w:t>
+              <w:t>Đồng bộ ngưỡng + xóa máy</w:t>
             </w:r>
           </w:p>
         </w:tc>
@@ -904,6 +904,102 @@
                 <w:color w:val="1F2937"/>
                 <w:sz w:val="18"/>
               </w:rPr>
+              <w:t>Quản trị Lưu → máy thí sinh nhận ngưỡng mới; giám thị có nút xóa máy offline khỏi lưới.</w:t>
+            </w:r>
+          </w:p>
+        </w:tc>
+        <w:tc>
+          <w:tcPr>
+            <w:tcW w:type="dxa" w:w="3515"/>
+            <w:tcBorders>
+              <w:top w:val="single" w:sz="4" w:color="D5DDE8"/>
+              <w:left w:val="single" w:sz="4" w:color="D5DDE8"/>
+              <w:bottom w:val="single" w:sz="4" w:color="D5DDE8"/>
+              <w:right w:val="single" w:sz="4" w:color="D5DDE8"/>
+            </w:tcBorders>
+            <w:tcMar>
+              <w:top w:w="60" w:type="dxa"/>
+              <w:left w:w="100" w:type="dxa"/>
+              <w:bottom w:w="60" w:type="dxa"/>
+              <w:right w:w="100" w:type="dxa"/>
+            </w:tcMar>
+            <w:shd w:val="clear" w:color="auto" w:fill="F8FAFC"/>
+          </w:tcPr>
+          <w:p>
+            <w:pPr>
+              <w:spacing w:after="0" w:line="264" w:lineRule="auto"/>
+            </w:pPr>
+            <w:r>
+              <w:rPr>
+                <w:rFonts w:ascii="Calibri" w:hAnsi="Calibri" w:cs="Calibri" w:eastAsia="Calibri"/>
+                <w:b w:val="0"/>
+                <w:color w:val="1F2937"/>
+                <w:sz w:val="18"/>
+              </w:rPr>
+              <w:t>Chỉnh 2→5 giây thấy thanh tiến trình đổi; bấm thùng rác trên ô máy.</w:t>
+            </w:r>
+          </w:p>
+        </w:tc>
+      </w:tr>
+      <w:tr>
+        <w:tc>
+          <w:tcPr>
+            <w:tcW w:type="dxa" w:w="1814"/>
+            <w:tcBorders>
+              <w:top w:val="single" w:sz="4" w:color="D5DDE8"/>
+              <w:left w:val="single" w:sz="4" w:color="D5DDE8"/>
+              <w:bottom w:val="single" w:sz="4" w:color="D5DDE8"/>
+              <w:right w:val="single" w:sz="4" w:color="D5DDE8"/>
+            </w:tcBorders>
+            <w:tcMar>
+              <w:top w:w="60" w:type="dxa"/>
+              <w:left w:w="100" w:type="dxa"/>
+              <w:bottom w:w="60" w:type="dxa"/>
+              <w:right w:w="100" w:type="dxa"/>
+            </w:tcMar>
+          </w:tcPr>
+          <w:p>
+            <w:pPr>
+              <w:spacing w:after="0" w:line="264" w:lineRule="auto"/>
+            </w:pPr>
+            <w:r>
+              <w:rPr>
+                <w:rFonts w:ascii="Calibri" w:hAnsi="Calibri" w:cs="Calibri" w:eastAsia="Calibri"/>
+                <w:b w:val="0"/>
+                <w:color w:val="1F2937"/>
+                <w:sz w:val="18"/>
+              </w:rPr>
+              <w:t>Buổi thử thầy cô</w:t>
+            </w:r>
+          </w:p>
+        </w:tc>
+        <w:tc>
+          <w:tcPr>
+            <w:tcW w:type="dxa" w:w="4082"/>
+            <w:tcBorders>
+              <w:top w:val="single" w:sz="4" w:color="D5DDE8"/>
+              <w:left w:val="single" w:sz="4" w:color="D5DDE8"/>
+              <w:bottom w:val="single" w:sz="4" w:color="D5DDE8"/>
+              <w:right w:val="single" w:sz="4" w:color="D5DDE8"/>
+            </w:tcBorders>
+            <w:tcMar>
+              <w:top w:w="60" w:type="dxa"/>
+              <w:left w:w="100" w:type="dxa"/>
+              <w:bottom w:w="60" w:type="dxa"/>
+              <w:right w:w="100" w:type="dxa"/>
+            </w:tcMar>
+          </w:tcPr>
+          <w:p>
+            <w:pPr>
+              <w:spacing w:after="0" w:line="264" w:lineRule="auto"/>
+            </w:pPr>
+            <w:r>
+              <w:rPr>
+                <w:rFonts w:ascii="Calibri" w:hAnsi="Calibri" w:cs="Calibri" w:eastAsia="Calibri"/>
+                <w:b w:val="0"/>
+                <w:color w:val="1F2937"/>
+                <w:sz w:val="18"/>
+              </w:rPr>
               <w:t>Nghe người dùng thật; phiếu; 1–2 sửa theo góp ý.</w:t>
             </w:r>
           </w:p>
@@ -923,7 +1019,6 @@
               <w:bottom w:w="60" w:type="dxa"/>
               <w:right w:w="100" w:type="dxa"/>
             </w:tcMar>
-            <w:shd w:val="clear" w:color="auto" w:fill="F8FAFC"/>
           </w:tcPr>
           <w:p>
             <w:pPr>
@@ -957,6 +1052,7 @@
               <w:bottom w:w="60" w:type="dxa"/>
               <w:right w:w="100" w:type="dxa"/>
             </w:tcMar>
+            <w:shd w:val="clear" w:color="auto" w:fill="F8FAFC"/>
           </w:tcPr>
           <w:p>
             <w:pPr>
@@ -988,6 +1084,7 @@
               <w:bottom w:w="60" w:type="dxa"/>
               <w:right w:w="100" w:type="dxa"/>
             </w:tcMar>
+            <w:shd w:val="clear" w:color="auto" w:fill="F8FAFC"/>
           </w:tcPr>
           <w:p>
             <w:pPr>
@@ -1019,6 +1116,7 @@
               <w:bottom w:w="60" w:type="dxa"/>
               <w:right w:w="100" w:type="dxa"/>
             </w:tcMar>
+            <w:shd w:val="clear" w:color="auto" w:fill="F8FAFC"/>
           </w:tcPr>
           <w:p>
             <w:pPr>
@@ -1598,7 +1696,7 @@
                 <w:color w:val="1F2937"/>
                 <w:sz w:val="18"/>
               </w:rPr>
-              <w:t xml:space="preserve"> quanh lúc xảy ra + biên bản chỉ lần đã xác nhận.</w:t>
+              <w:t xml:space="preserve"> quanh lúc xảy ra + biên bản các lần đã kết luận.</w:t>
             </w:r>
           </w:p>
         </w:tc>
@@ -1647,7 +1745,7 @@
                 <w:color w:val="1F2937"/>
                 <w:sz w:val="18"/>
               </w:rPr>
-              <w:t>.</w:t>
+              <w:t xml:space="preserve"> (gồm đúng + báo nhầm).</w:t>
             </w:r>
           </w:p>
         </w:tc>
@@ -4764,7 +4862,7 @@
                 <w:color w:val="1F2937"/>
                 <w:sz w:val="16"/>
               </w:rPr>
-              <w:t xml:space="preserve">Cột Kết luận; hàm biên bản chỉ </w:t>
+              <w:t xml:space="preserve">Cột Kết luận; biên bản gồm </w:t>
             </w:r>
             <w:r>
               <w:rPr>
@@ -4774,6 +4872,24 @@
                 <w:sz w:val="14"/>
               </w:rPr>
               <w:t>confirmed</w:t>
+            </w:r>
+            <w:r>
+              <w:rPr>
+                <w:rFonts w:ascii="Calibri" w:hAnsi="Calibri" w:cs="Calibri" w:eastAsia="Calibri"/>
+                <w:b w:val="0"/>
+                <w:color w:val="1F2937"/>
+                <w:sz w:val="16"/>
+              </w:rPr>
+              <w:t xml:space="preserve"> và </w:t>
+            </w:r>
+            <w:r>
+              <w:rPr>
+                <w:rFonts w:ascii="Consolas" w:hAnsi="Consolas" w:cs="Consolas" w:eastAsia="Consolas"/>
+                <w:b w:val="0"/>
+                <w:color w:val="9A3412"/>
+                <w:sz w:val="14"/>
+              </w:rPr>
+              <w:t>false_alarm</w:t>
             </w:r>
             <w:r>
               <w:rPr>
@@ -4879,7 +4995,7 @@
                 <w:color w:val="1F2937"/>
                 <w:sz w:val="16"/>
               </w:rPr>
-              <w:t>Nối nút → markEventReviewed; nút xuất biên bản.</w:t>
+              <w:t>Nối nút → markEventReviewed; nút xuất biên bản; xóa máy.</w:t>
             </w:r>
           </w:p>
         </w:tc>
@@ -5436,12 +5552,12 @@
         <w:tc>
           <w:tcPr>
             <w:tcW w:type="dxa" w:w="9411"/>
-            <w:shd w:val="clear" w:color="auto" w:fill="FDECEA"/>
+            <w:shd w:val="clear" w:color="auto" w:fill="E8F1FB"/>
             <w:tcBorders>
-              <w:top w:val="single" w:sz="4" w:color="FDECEA"/>
-              <w:left w:val="single" w:sz="24" w:color="C0392B"/>
-              <w:bottom w:val="single" w:sz="4" w:color="FDECEA"/>
-              <w:right w:val="single" w:sz="4" w:color="FDECEA"/>
+              <w:top w:val="single" w:sz="4" w:color="E8F1FB"/>
+              <w:left w:val="single" w:sz="24" w:color="2E74B5"/>
+              <w:bottom w:val="single" w:sz="4" w:color="E8F1FB"/>
+              <w:right w:val="single" w:sz="4" w:color="E8F1FB"/>
             </w:tcBorders>
             <w:tcMar>
               <w:top w:w="100" w:type="dxa"/>
@@ -5458,10 +5574,10 @@
               <w:rPr>
                 <w:rFonts w:ascii="Calibri" w:hAnsi="Calibri" w:cs="Calibri" w:eastAsia="Calibri"/>
                 <w:b/>
-                <w:color w:val="C0392B"/>
+                <w:color w:val="2E74B5"/>
                 <w:sz w:val="21"/>
               </w:rPr>
-              <w:t>LƯU Ý</w:t>
+              <w:t>GHI NHỚ</w:t>
             </w:r>
           </w:p>
           <w:p>
@@ -5471,20 +5587,11 @@
             <w:r>
               <w:rPr>
                 <w:rFonts w:ascii="Calibri" w:hAnsi="Calibri" w:cs="Calibri" w:eastAsia="Calibri"/>
-                <w:b/>
-                <w:color w:val="1F2937"/>
-                <w:sz w:val="22"/>
-              </w:rPr>
-              <w:t>Cách chính đúng ý giám khảo:</w:t>
-            </w:r>
-            <w:r>
-              <w:rPr>
-                <w:rFonts w:ascii="Calibri" w:hAnsi="Calibri" w:cs="Calibri" w:eastAsia="Calibri"/>
                 <w:b w:val="0"/>
                 <w:color w:val="1F2937"/>
                 <w:sz w:val="22"/>
               </w:rPr>
-              <w:t xml:space="preserve"> viết kịch bản → </w:t>
+              <w:t xml:space="preserve">Cách làm đúng ý giám khảo: viết kịch bản → </w:t>
             </w:r>
             <w:r>
               <w:rPr>
@@ -5538,30 +5645,7 @@
                 <w:color w:val="1F2937"/>
                 <w:sz w:val="22"/>
               </w:rPr>
-              <w:t xml:space="preserve"> thử/chỉnh làm bằng chứng.</w:t>
-            </w:r>
-          </w:p>
-          <w:p>
-            <w:pPr>
-              <w:spacing w:after="40"/>
-            </w:pPr>
-            <w:r>
-              <w:rPr>
-                <w:rFonts w:ascii="Calibri" w:hAnsi="Calibri" w:cs="Calibri" w:eastAsia="Calibri"/>
-                <w:b/>
-                <w:color w:val="1F2937"/>
-                <w:sz w:val="22"/>
-              </w:rPr>
-              <w:t>Không phải cách chính:</w:t>
-            </w:r>
-            <w:r>
-              <w:rPr>
-                <w:rFonts w:ascii="Calibri" w:hAnsi="Calibri" w:cs="Calibri" w:eastAsia="Calibri"/>
-                <w:b w:val="0"/>
-                <w:color w:val="1F2937"/>
-                <w:sz w:val="22"/>
-              </w:rPr>
-              <w:t xml:space="preserve"> chỉ quay một file rồi “đưa AI nhận diện” rồi thôi, mà không có bảng số và không chỉnh ngưỡng có chủ đích.</w:t>
+              <w:t xml:space="preserve"> thử/chỉnh làm bằng chứng (có bảng số liệu).</w:t>
             </w:r>
           </w:p>
         </w:tc>
@@ -6379,6 +6463,271 @@
                 <w:color w:val="9A3412"/>
                 <w:sz w:val="16"/>
               </w:rPr>
+              <w:t>web/src/features/admin/admin-screen.tsx</w:t>
+            </w:r>
+            <w:r>
+              <w:rPr>
+                <w:rFonts w:ascii="Calibri" w:hAnsi="Calibri" w:cs="Calibri" w:eastAsia="Calibri"/>
+                <w:b w:val="0"/>
+                <w:color w:val="1F2937"/>
+                <w:sz w:val="18"/>
+              </w:rPr>
+              <w:t xml:space="preserve"> + </w:t>
+            </w:r>
+            <w:r>
+              <w:rPr>
+                <w:rFonts w:ascii="Consolas" w:hAnsi="Consolas" w:cs="Consolas" w:eastAsia="Consolas"/>
+                <w:b w:val="0"/>
+                <w:color w:val="9A3412"/>
+                <w:sz w:val="16"/>
+              </w:rPr>
+              <w:t>hub-settings.ts</w:t>
+            </w:r>
+          </w:p>
+        </w:tc>
+        <w:tc>
+          <w:tcPr>
+            <w:tcW w:type="dxa" w:w="2948"/>
+            <w:tcBorders>
+              <w:top w:val="single" w:sz="4" w:color="D5DDE8"/>
+              <w:left w:val="single" w:sz="4" w:color="D5DDE8"/>
+              <w:bottom w:val="single" w:sz="4" w:color="D5DDE8"/>
+              <w:right w:val="single" w:sz="4" w:color="D5DDE8"/>
+            </w:tcBorders>
+            <w:tcMar>
+              <w:top w:w="60" w:type="dxa"/>
+              <w:left w:w="100" w:type="dxa"/>
+              <w:bottom w:w="60" w:type="dxa"/>
+              <w:right w:w="100" w:type="dxa"/>
+            </w:tcMar>
+          </w:tcPr>
+          <w:p>
+            <w:pPr>
+              <w:spacing w:after="0" w:line="264" w:lineRule="auto"/>
+            </w:pPr>
+            <w:r>
+              <w:rPr>
+                <w:rFonts w:ascii="Calibri" w:hAnsi="Calibri" w:cs="Calibri" w:eastAsia="Calibri"/>
+                <w:b w:val="0"/>
+                <w:color w:val="1F2937"/>
+                <w:sz w:val="18"/>
+              </w:rPr>
+              <w:t xml:space="preserve">Bấm </w:t>
+            </w:r>
+            <w:r>
+              <w:rPr>
+                <w:rFonts w:ascii="Calibri" w:hAnsi="Calibri" w:cs="Calibri" w:eastAsia="Calibri"/>
+                <w:b/>
+                <w:color w:val="1F2937"/>
+                <w:sz w:val="18"/>
+              </w:rPr>
+              <w:t>Lưu thay đổi</w:t>
+            </w:r>
+            <w:r>
+              <w:rPr>
+                <w:rFonts w:ascii="Calibri" w:hAnsi="Calibri" w:cs="Calibri" w:eastAsia="Calibri"/>
+                <w:b w:val="0"/>
+                <w:color w:val="1F2937"/>
+                <w:sz w:val="18"/>
+              </w:rPr>
+              <w:t xml:space="preserve"> → đẩy </w:t>
+            </w:r>
+            <w:r>
+              <w:rPr>
+                <w:rFonts w:ascii="Calibri" w:hAnsi="Calibri" w:cs="Calibri" w:eastAsia="Calibri"/>
+                <w:b/>
+                <w:color w:val="1F2937"/>
+                <w:sz w:val="18"/>
+              </w:rPr>
+              <w:t>cả ngưỡng</w:t>
+            </w:r>
+            <w:r>
+              <w:rPr>
+                <w:rFonts w:ascii="Calibri" w:hAnsi="Calibri" w:cs="Calibri" w:eastAsia="Calibri"/>
+                <w:b w:val="0"/>
+                <w:color w:val="1F2937"/>
+                <w:sz w:val="18"/>
+              </w:rPr>
+              <w:t xml:space="preserve"> lên hub </w:t>
+            </w:r>
+            <w:r>
+              <w:rPr>
+                <w:rFonts w:ascii="Consolas" w:hAnsi="Consolas" w:cs="Consolas" w:eastAsia="Consolas"/>
+                <w:b w:val="0"/>
+                <w:color w:val="9A3412"/>
+                <w:sz w:val="16"/>
+              </w:rPr>
+              <w:t>/api/settings</w:t>
+            </w:r>
+            <w:r>
+              <w:rPr>
+                <w:rFonts w:ascii="Calibri" w:hAnsi="Calibri" w:cs="Calibri" w:eastAsia="Calibri"/>
+                <w:b w:val="0"/>
+                <w:color w:val="1F2937"/>
+                <w:sz w:val="18"/>
+              </w:rPr>
+              <w:t>.</w:t>
+            </w:r>
+          </w:p>
+        </w:tc>
+        <w:tc>
+          <w:tcPr>
+            <w:tcW w:type="dxa" w:w="3855"/>
+            <w:tcBorders>
+              <w:top w:val="single" w:sz="4" w:color="D5DDE8"/>
+              <w:left w:val="single" w:sz="4" w:color="D5DDE8"/>
+              <w:bottom w:val="single" w:sz="4" w:color="D5DDE8"/>
+              <w:right w:val="single" w:sz="4" w:color="D5DDE8"/>
+            </w:tcBorders>
+            <w:tcMar>
+              <w:top w:w="60" w:type="dxa"/>
+              <w:left w:w="100" w:type="dxa"/>
+              <w:bottom w:w="60" w:type="dxa"/>
+              <w:right w:w="100" w:type="dxa"/>
+            </w:tcMar>
+          </w:tcPr>
+          <w:p>
+            <w:pPr>
+              <w:spacing w:after="0" w:line="264" w:lineRule="auto"/>
+            </w:pPr>
+            <w:r>
+              <w:rPr>
+                <w:rFonts w:ascii="Calibri" w:hAnsi="Calibri" w:cs="Calibri" w:eastAsia="Calibri"/>
+                <w:b w:val="0"/>
+                <w:color w:val="1F2937"/>
+                <w:sz w:val="18"/>
+              </w:rPr>
+              <w:t>Trước chỉ lưu trên trình duyệt Quản trị → máy thí sinh khác không đổi. Giờ cả phòng dùng chung.</w:t>
+            </w:r>
+          </w:p>
+        </w:tc>
+      </w:tr>
+      <w:tr>
+        <w:tc>
+          <w:tcPr>
+            <w:tcW w:type="dxa" w:w="2608"/>
+            <w:tcBorders>
+              <w:top w:val="single" w:sz="4" w:color="D5DDE8"/>
+              <w:left w:val="single" w:sz="4" w:color="D5DDE8"/>
+              <w:bottom w:val="single" w:sz="4" w:color="D5DDE8"/>
+              <w:right w:val="single" w:sz="4" w:color="D5DDE8"/>
+            </w:tcBorders>
+            <w:tcMar>
+              <w:top w:w="60" w:type="dxa"/>
+              <w:left w:w="100" w:type="dxa"/>
+              <w:bottom w:w="60" w:type="dxa"/>
+              <w:right w:w="100" w:type="dxa"/>
+            </w:tcMar>
+            <w:shd w:val="clear" w:color="auto" w:fill="F8FAFC"/>
+          </w:tcPr>
+          <w:p>
+            <w:pPr>
+              <w:spacing w:after="0" w:line="264" w:lineRule="auto"/>
+            </w:pPr>
+            <w:r>
+              <w:rPr>
+                <w:rFonts w:ascii="Consolas" w:hAnsi="Consolas" w:cs="Consolas" w:eastAsia="Consolas"/>
+                <w:b w:val="0"/>
+                <w:color w:val="9A3412"/>
+                <w:sz w:val="16"/>
+              </w:rPr>
+              <w:t>use-monitoring-session.ts</w:t>
+            </w:r>
+          </w:p>
+        </w:tc>
+        <w:tc>
+          <w:tcPr>
+            <w:tcW w:type="dxa" w:w="2948"/>
+            <w:tcBorders>
+              <w:top w:val="single" w:sz="4" w:color="D5DDE8"/>
+              <w:left w:val="single" w:sz="4" w:color="D5DDE8"/>
+              <w:bottom w:val="single" w:sz="4" w:color="D5DDE8"/>
+              <w:right w:val="single" w:sz="4" w:color="D5DDE8"/>
+            </w:tcBorders>
+            <w:tcMar>
+              <w:top w:w="60" w:type="dxa"/>
+              <w:left w:w="100" w:type="dxa"/>
+              <w:bottom w:w="60" w:type="dxa"/>
+              <w:right w:w="100" w:type="dxa"/>
+            </w:tcMar>
+            <w:shd w:val="clear" w:color="auto" w:fill="F8FAFC"/>
+          </w:tcPr>
+          <w:p>
+            <w:pPr>
+              <w:spacing w:after="0" w:line="264" w:lineRule="auto"/>
+            </w:pPr>
+            <w:r>
+              <w:rPr>
+                <w:rFonts w:ascii="Calibri" w:hAnsi="Calibri" w:cs="Calibri" w:eastAsia="Calibri"/>
+                <w:b w:val="0"/>
+                <w:color w:val="1F2937"/>
+                <w:sz w:val="18"/>
+              </w:rPr>
+              <w:t>Khi bắt đầu phiên và mỗi ~2 giây: đọc ngưỡng từ hub (ưu tiên) hoặc local.</w:t>
+            </w:r>
+          </w:p>
+        </w:tc>
+        <w:tc>
+          <w:tcPr>
+            <w:tcW w:type="dxa" w:w="3855"/>
+            <w:tcBorders>
+              <w:top w:val="single" w:sz="4" w:color="D5DDE8"/>
+              <w:left w:val="single" w:sz="4" w:color="D5DDE8"/>
+              <w:bottom w:val="single" w:sz="4" w:color="D5DDE8"/>
+              <w:right w:val="single" w:sz="4" w:color="D5DDE8"/>
+            </w:tcBorders>
+            <w:tcMar>
+              <w:top w:w="60" w:type="dxa"/>
+              <w:left w:w="100" w:type="dxa"/>
+              <w:bottom w:w="60" w:type="dxa"/>
+              <w:right w:w="100" w:type="dxa"/>
+            </w:tcMar>
+            <w:shd w:val="clear" w:color="auto" w:fill="F8FAFC"/>
+          </w:tcPr>
+          <w:p>
+            <w:pPr>
+              <w:spacing w:after="0" w:line="264" w:lineRule="auto"/>
+            </w:pPr>
+            <w:r>
+              <w:rPr>
+                <w:rFonts w:ascii="Calibri" w:hAnsi="Calibri" w:cs="Calibri" w:eastAsia="Calibri"/>
+                <w:b w:val="0"/>
+                <w:color w:val="1F2937"/>
+                <w:sz w:val="18"/>
+              </w:rPr>
+              <w:t>Đang thi vẫn cập nhật thanh “x / N giây” khi quản trị vừa lưu.</w:t>
+            </w:r>
+          </w:p>
+        </w:tc>
+      </w:tr>
+      <w:tr>
+        <w:tc>
+          <w:tcPr>
+            <w:tcW w:type="dxa" w:w="2608"/>
+            <w:tcBorders>
+              <w:top w:val="single" w:sz="4" w:color="D5DDE8"/>
+              <w:left w:val="single" w:sz="4" w:color="D5DDE8"/>
+              <w:bottom w:val="single" w:sz="4" w:color="D5DDE8"/>
+              <w:right w:val="single" w:sz="4" w:color="D5DDE8"/>
+            </w:tcBorders>
+            <w:tcMar>
+              <w:top w:w="60" w:type="dxa"/>
+              <w:left w:w="100" w:type="dxa"/>
+              <w:bottom w:w="60" w:type="dxa"/>
+              <w:right w:w="100" w:type="dxa"/>
+            </w:tcMar>
+          </w:tcPr>
+          <w:p>
+            <w:pPr>
+              <w:spacing w:after="0" w:line="264" w:lineRule="auto"/>
+            </w:pPr>
+            <w:r>
+              <w:rPr>
+                <w:rFonts w:ascii="Consolas" w:hAnsi="Consolas" w:cs="Consolas" w:eastAsia="Consolas"/>
+                <w:b w:val="0"/>
+                <w:color w:val="9A3412"/>
+                <w:sz w:val="16"/>
+              </w:rPr>
               <w:t>web/tests/unit/domain.test.cjs</w:t>
             </w:r>
           </w:p>
@@ -6452,6 +6801,87 @@
         <w:spacing w:after="40"/>
       </w:pPr>
     </w:p>
+    <w:tbl>
+      <w:tblPr>
+        <w:tblW w:type="auto" w:w="0"/>
+        <w:jc w:val="center"/>
+        <w:tblLook w:firstColumn="1" w:firstRow="1" w:lastColumn="0" w:lastRow="0" w:noHBand="0" w:noVBand="1" w:val="04A0"/>
+      </w:tblPr>
+      <w:tblGrid>
+        <w:gridCol w:w="9412"/>
+      </w:tblGrid>
+      <w:tr>
+        <w:tc>
+          <w:tcPr>
+            <w:tcW w:type="dxa" w:w="9411"/>
+            <w:shd w:val="clear" w:color="auto" w:fill="FDECEA"/>
+            <w:tcBorders>
+              <w:top w:val="single" w:sz="4" w:color="FDECEA"/>
+              <w:left w:val="single" w:sz="24" w:color="C0392B"/>
+              <w:bottom w:val="single" w:sz="4" w:color="FDECEA"/>
+              <w:right w:val="single" w:sz="4" w:color="FDECEA"/>
+            </w:tcBorders>
+            <w:tcMar>
+              <w:top w:w="100" w:type="dxa"/>
+              <w:left w:w="180" w:type="dxa"/>
+              <w:bottom w:w="100" w:type="dxa"/>
+              <w:right w:w="180" w:type="dxa"/>
+            </w:tcMar>
+          </w:tcPr>
+          <w:p>
+            <w:pPr>
+              <w:spacing w:after="40"/>
+            </w:pPr>
+            <w:r>
+              <w:rPr>
+                <w:rFonts w:ascii="Calibri" w:hAnsi="Calibri" w:cs="Calibri" w:eastAsia="Calibri"/>
+                <w:b/>
+                <w:color w:val="C0392B"/>
+                <w:sz w:val="21"/>
+              </w:rPr>
+              <w:t>LƯU Ý</w:t>
+            </w:r>
+          </w:p>
+          <w:p>
+            <w:pPr>
+              <w:spacing w:after="40"/>
+            </w:pPr>
+            <w:r>
+              <w:rPr>
+                <w:rFonts w:ascii="Calibri" w:hAnsi="Calibri" w:cs="Calibri" w:eastAsia="Calibri"/>
+                <w:b w:val="0"/>
+                <w:color w:val="1F2937"/>
+                <w:sz w:val="22"/>
+              </w:rPr>
+              <w:t xml:space="preserve">Muốn máy thí sinh nhận ngưỡng mới: Quản trị phải bấm </w:t>
+            </w:r>
+            <w:r>
+              <w:rPr>
+                <w:rFonts w:ascii="Calibri" w:hAnsi="Calibri" w:cs="Calibri" w:eastAsia="Calibri"/>
+                <w:b/>
+                <w:color w:val="1F2937"/>
+                <w:sz w:val="22"/>
+              </w:rPr>
+              <w:t>Lưu thay đổi</w:t>
+            </w:r>
+            <w:r>
+              <w:rPr>
+                <w:rFonts w:ascii="Calibri" w:hAnsi="Calibri" w:cs="Calibri" w:eastAsia="Calibri"/>
+                <w:b w:val="0"/>
+                <w:color w:val="1F2937"/>
+                <w:sz w:val="22"/>
+              </w:rPr>
+              <w:t xml:space="preserve"> (không chỉ gõ số rồi thôi). Hub phải đang chạy.</w:t>
+            </w:r>
+          </w:p>
+        </w:tc>
+      </w:tr>
+    </w:tbl>
+    <w:p>
+      <w:pPr>
+        <w:spacing w:after="40"/>
+      </w:pPr>
+    </w:p>
     <w:p>
       <w:pPr>
         <w:pStyle w:val="Heading2"/>
@@ -6756,7 +7186,7 @@
           <w:b w:val="0"/>
           <w:color w:val="1F2937"/>
         </w:rPr>
-        <w:t xml:space="preserve">. Cần xem lại vài giây trước và trong lúc xảy ra. Cuối buổi cần bản tổng kết </w:t>
+        <w:t xml:space="preserve">. Cần xem lại vài giây trước và trong lúc xảy ra. Cuối buổi cần bản tổng kết các lần </w:t>
       </w:r>
       <w:r>
         <w:rPr>
@@ -6764,7 +7194,7 @@
           <w:b/>
           <w:color w:val="1F2937"/>
         </w:rPr>
-        <w:t>chỉ những lần người đã xác nhận</w:t>
+        <w:t>giám thị đã kết luận</w:t>
       </w:r>
       <w:r>
         <w:rPr>
@@ -6772,7 +7202,7 @@
           <w:b w:val="0"/>
           <w:color w:val="1F2937"/>
         </w:rPr>
-        <w:t>.</w:t>
+        <w:t xml:space="preserve"> (đúng hoặc báo nhầm), không lẫn cảnh báo chưa kiểm tra.</w:t>
       </w:r>
     </w:p>
     <w:p>
@@ -6853,7 +7283,7 @@
                 <w:color w:val="1F2937"/>
                 <w:sz w:val="22"/>
               </w:rPr>
-              <w:t xml:space="preserve"> được tạo lúc bấm “Xác nhận đúng”.</w:t>
+              <w:t xml:space="preserve"> được tạo lúc bấm “Xác nhận đúng” hay “Báo nhầm”.</w:t>
             </w:r>
           </w:p>
           <w:p>
@@ -6899,7 +7329,7 @@
                 <w:color w:val="1F2937"/>
                 <w:sz w:val="22"/>
               </w:rPr>
-              <w:t>Nút xác nhận chỉ gắn nhãn đúng/nhầm lên cảnh báo đã có.</w:t>
+              <w:t>Hai nút kết luận chỉ gắn nhãn đúng/nhầm lên cảnh báo đã có.</w:t>
             </w:r>
           </w:p>
         </w:tc>
@@ -7083,6 +7513,28 @@
     </w:p>
     <w:p>
       <w:pPr>
+        <w:pStyle w:val="ListBullet"/>
+        <w:spacing w:after="60"/>
+      </w:pPr>
+      <w:r>
+        <w:rPr>
+          <w:rFonts w:ascii="Calibri" w:hAnsi="Calibri" w:cs="Calibri" w:eastAsia="Calibri"/>
+          <w:b/>
+          <w:color w:val="1F2937"/>
+        </w:rPr>
+        <w:t>Không nhét clip vào localStorage</w:t>
+      </w:r>
+      <w:r>
+        <w:rPr>
+          <w:rFonts w:ascii="Calibri" w:hAnsi="Calibri" w:cs="Calibri" w:eastAsia="Calibri"/>
+          <w:b w:val="0"/>
+          <w:color w:val="1F2937"/>
+        </w:rPr>
+        <w:t xml:space="preserve"> máy thí sinh (dễ đầy bộ nhớ → hỏng cả lần gửi cảnh báo).</w:t>
+      </w:r>
+    </w:p>
+    <w:p>
+      <w:pPr>
         <w:pStyle w:val="Heading2"/>
       </w:pPr>
       <w:r>
@@ -7197,7 +7649,7 @@
           <w:b w:val="0"/>
           <w:color w:val="1F2937"/>
         </w:rPr>
-        <w:t xml:space="preserve"> (công tắc được đọc lúc bắt đầu).</w:t>
+        <w:t xml:space="preserve"> (công tắc được đọc lúc bắt đầu / đang chạy).</w:t>
       </w:r>
     </w:p>
     <w:p>
@@ -7330,16 +7782,15 @@
           <w:b w:val="0"/>
           <w:color w:val="1F2937"/>
         </w:rPr>
-        <w:t xml:space="preserve"> (chỉ các lần </w:t>
-      </w:r>
-      <w:r>
-        <w:rPr>
-          <w:rFonts w:ascii="Consolas" w:hAnsi="Consolas" w:cs="Consolas" w:eastAsia="Consolas"/>
-          <w:b w:val="0"/>
-          <w:color w:val="9A3412"/>
-          <w:sz w:val="21"/>
-        </w:rPr>
-        <w:t>confirmed</w:t>
+        <w:t xml:space="preserve">: gồm cả </w:t>
+      </w:r>
+      <w:r>
+        <w:rPr>
+          <w:rFonts w:ascii="Calibri" w:hAnsi="Calibri" w:cs="Calibri" w:eastAsia="Calibri"/>
+          <w:b/>
+          <w:color w:val="1F2937"/>
+        </w:rPr>
+        <w:t>Xác nhận đúng</w:t>
       </w:r>
       <w:r>
         <w:rPr>
@@ -7347,7 +7798,39 @@
           <w:b w:val="0"/>
           <w:color w:val="1F2937"/>
         </w:rPr>
-        <w:t>).</w:t>
+        <w:t xml:space="preserve"> và </w:t>
+      </w:r>
+      <w:r>
+        <w:rPr>
+          <w:rFonts w:ascii="Calibri" w:hAnsi="Calibri" w:cs="Calibri" w:eastAsia="Calibri"/>
+          <w:b/>
+          <w:color w:val="1F2937"/>
+        </w:rPr>
+        <w:t>Báo nhầm</w:t>
+      </w:r>
+      <w:r>
+        <w:rPr>
+          <w:rFonts w:ascii="Calibri" w:hAnsi="Calibri" w:cs="Calibri" w:eastAsia="Calibri"/>
+          <w:b w:val="0"/>
+          <w:color w:val="1F2937"/>
+        </w:rPr>
+        <w:t xml:space="preserve"> (cột Kết luận phân biệt); </w:t>
+      </w:r>
+      <w:r>
+        <w:rPr>
+          <w:rFonts w:ascii="Calibri" w:hAnsi="Calibri" w:cs="Calibri" w:eastAsia="Calibri"/>
+          <w:b/>
+          <w:color w:val="1F2937"/>
+        </w:rPr>
+        <w:t>không</w:t>
+      </w:r>
+      <w:r>
+        <w:rPr>
+          <w:rFonts w:ascii="Calibri" w:hAnsi="Calibri" w:cs="Calibri" w:eastAsia="Calibri"/>
+          <w:b w:val="0"/>
+          <w:color w:val="1F2937"/>
+        </w:rPr>
+        <w:t xml:space="preserve"> gồm cảnh báo chưa bấm nút.</w:t>
       </w:r>
     </w:p>
     <w:p>
@@ -7957,7 +8440,7 @@
                 <w:color w:val="9A3412"/>
                 <w:sz w:val="14"/>
               </w:rPr>
-              <w:t>web/src/services/hub/hub-settings.ts</w:t>
+              <w:t>hub-settings.ts</w:t>
             </w:r>
           </w:p>
         </w:tc>
@@ -7997,7 +8480,7 @@
                 <w:color w:val="1F2937"/>
                 <w:sz w:val="16"/>
               </w:rPr>
-              <w:t>đẩy công tắc lên hub</w:t>
+              <w:t>đẩy công tắc + ngưỡng</w:t>
             </w:r>
             <w:r>
               <w:rPr>
@@ -8006,7 +8489,7 @@
                 <w:color w:val="1F2937"/>
                 <w:sz w:val="16"/>
               </w:rPr>
-              <w:t xml:space="preserve"> </w:t>
+              <w:t xml:space="preserve"> lên hub </w:t>
             </w:r>
             <w:r>
               <w:rPr>
@@ -8055,7 +8538,7 @@
                 <w:color w:val="1F2937"/>
                 <w:sz w:val="16"/>
               </w:rPr>
-              <w:t>Trước đây chỉ lưu trên máy mở Quản trị → máy thí sinh khác không biết. Đẩy lên hub để cả phòng dùng chung.</w:t>
+              <w:t>Máy thí sinh khác trong phòng đọc cùng một cấu hình.</w:t>
             </w:r>
           </w:p>
         </w:tc>
@@ -8242,6 +8725,24 @@
               </w:rPr>
               <w:t>web/src/services/exam-sync.ts</w:t>
             </w:r>
+            <w:r>
+              <w:rPr>
+                <w:rFonts w:ascii="Calibri" w:hAnsi="Calibri" w:cs="Calibri" w:eastAsia="Calibri"/>
+                <w:b w:val="0"/>
+                <w:color w:val="1F2937"/>
+                <w:sz w:val="16"/>
+              </w:rPr>
+              <w:t xml:space="preserve"> + </w:t>
+            </w:r>
+            <w:r>
+              <w:rPr>
+                <w:rFonts w:ascii="Consolas" w:hAnsi="Consolas" w:cs="Consolas" w:eastAsia="Consolas"/>
+                <w:b w:val="0"/>
+                <w:color w:val="9A3412"/>
+                <w:sz w:val="14"/>
+              </w:rPr>
+              <w:t>outbox.ts</w:t>
+            </w:r>
           </w:p>
         </w:tc>
         <w:tc>
@@ -8271,25 +8772,7 @@
                 <w:color w:val="1F2937"/>
                 <w:sz w:val="16"/>
               </w:rPr>
-              <w:t xml:space="preserve">Cảnh báo có clip gửi </w:t>
-            </w:r>
-            <w:r>
-              <w:rPr>
-                <w:rFonts w:ascii="Calibri" w:hAnsi="Calibri" w:cs="Calibri" w:eastAsia="Calibri"/>
-                <w:b/>
-                <w:color w:val="1F2937"/>
-                <w:sz w:val="16"/>
-              </w:rPr>
-              <w:t>thẳng</w:t>
-            </w:r>
-            <w:r>
-              <w:rPr>
-                <w:rFonts w:ascii="Calibri" w:hAnsi="Calibri" w:cs="Calibri" w:eastAsia="Calibri"/>
-                <w:b w:val="0"/>
-                <w:color w:val="1F2937"/>
-                <w:sz w:val="16"/>
-              </w:rPr>
-              <w:t xml:space="preserve"> hub (không nhét localStorage).</w:t>
+              <w:t>Clip gửi thẳng hub; bản chữ xếp hộp thư đi; không nhét media vào localStorage.</w:t>
             </w:r>
           </w:p>
         </w:tc>
@@ -8320,7 +8803,7 @@
                 <w:color w:val="1F2937"/>
                 <w:sz w:val="16"/>
               </w:rPr>
-              <w:t>Clip lớn dễ vượt hạn mức localStorage của hộp thư đi → mất media mà vẫn tưởng đã gửi.</w:t>
+              <w:t>Tránh đầy ổ nhớ trình duyệt làm mất cả cảnh báo chữ.</w:t>
             </w:r>
           </w:p>
         </w:tc>
@@ -8574,12 +9057,21 @@
             </w:pPr>
             <w:r>
               <w:rPr>
+                <w:rFonts w:ascii="Calibri" w:hAnsi="Calibri" w:cs="Calibri" w:eastAsia="Calibri"/>
+                <w:b w:val="0"/>
+                <w:color w:val="1F2937"/>
+                <w:sz w:val="16"/>
+              </w:rPr>
+              <w:t xml:space="preserve">Biên bản: </w:t>
+            </w:r>
+            <w:r>
+              <w:rPr>
                 <w:rFonts w:ascii="Consolas" w:hAnsi="Consolas" w:cs="Consolas" w:eastAsia="Consolas"/>
                 <w:b w:val="0"/>
                 <w:color w:val="9A3412"/>
                 <w:sz w:val="14"/>
               </w:rPr>
-              <w:t>downloadConfirmedCsv</w:t>
+              <w:t>confirmed</w:t>
             </w:r>
             <w:r>
               <w:rPr>
@@ -8588,7 +9080,25 @@
                 <w:color w:val="1F2937"/>
                 <w:sz w:val="16"/>
               </w:rPr>
-              <w:t xml:space="preserve"> lọc </w:t>
+              <w:t xml:space="preserve"> </w:t>
+            </w:r>
+            <w:r>
+              <w:rPr>
+                <w:rFonts w:ascii="Calibri" w:hAnsi="Calibri" w:cs="Calibri" w:eastAsia="Calibri"/>
+                <w:b/>
+                <w:color w:val="1F2937"/>
+                <w:sz w:val="16"/>
+              </w:rPr>
+              <w:t>hoặc</w:t>
+            </w:r>
+            <w:r>
+              <w:rPr>
+                <w:rFonts w:ascii="Calibri" w:hAnsi="Calibri" w:cs="Calibri" w:eastAsia="Calibri"/>
+                <w:b w:val="0"/>
+                <w:color w:val="1F2937"/>
+                <w:sz w:val="16"/>
+              </w:rPr>
+              <w:t xml:space="preserve"> </w:t>
             </w:r>
             <w:r>
               <w:rPr>
@@ -8597,7 +9107,7 @@
                 <w:color w:val="9A3412"/>
                 <w:sz w:val="14"/>
               </w:rPr>
-              <w:t>verdict === 'confirmed'</w:t>
+              <w:t>false_alarm</w:t>
             </w:r>
             <w:r>
               <w:rPr>
@@ -8638,7 +9148,7 @@
                 <w:color w:val="1F2937"/>
                 <w:sz w:val="16"/>
               </w:rPr>
-              <w:t>Biên bản sạch — đúng yêu cầu “chỉ lần đã xác nhận”.</w:t>
+              <w:t>Đủ hồ sơ buổi thi: vừa lần đúng vừa lần báo oan (đã kiểm tra).</w:t>
             </w:r>
           </w:p>
         </w:tc>
@@ -8861,7 +9371,724 @@
         <w:pStyle w:val="Heading1"/>
       </w:pPr>
       <w:r>
-        <w:t>6. Cải tiến 4 — Buổi thử thật với thầy cô (không phải code)</w:t>
+        <w:t>6. Cải tiến vận hành sau khi triển khai (cần biết khi vấn đáp sâu)</w:t>
+      </w:r>
+    </w:p>
+    <w:p>
+      <w:r>
+        <w:rPr>
+          <w:rFonts w:ascii="Calibri" w:hAnsi="Calibri" w:cs="Calibri" w:eastAsia="Calibri"/>
+          <w:b w:val="0"/>
+          <w:color w:val="1F2937"/>
+        </w:rPr>
+        <w:t xml:space="preserve">Sau khi làm đủ 4 góp ý, nhóm còn chỉnh thêm vài chỗ để </w:t>
+      </w:r>
+      <w:r>
+        <w:rPr>
+          <w:rFonts w:ascii="Calibri" w:hAnsi="Calibri" w:cs="Calibri" w:eastAsia="Calibri"/>
+          <w:b/>
+          <w:color w:val="1F2937"/>
+        </w:rPr>
+        <w:t>demo ổn định</w:t>
+      </w:r>
+      <w:r>
+        <w:rPr>
+          <w:rFonts w:ascii="Calibri" w:hAnsi="Calibri" w:cs="Calibri" w:eastAsia="Calibri"/>
+          <w:b w:val="0"/>
+          <w:color w:val="1F2937"/>
+        </w:rPr>
+        <w:t xml:space="preserve"> trên nhiều máy. Giám khảo có thể hỏi — học thuộc ý, không cần thuộc code.</w:t>
+      </w:r>
+    </w:p>
+    <w:p>
+      <w:pPr>
+        <w:pStyle w:val="Heading2"/>
+      </w:pPr>
+      <w:r>
+        <w:t>6.1. Nút xóa máy trên lưới giám thị</w:t>
+      </w:r>
+    </w:p>
+    <w:p>
+      <w:pPr>
+        <w:pStyle w:val="ListBullet"/>
+        <w:spacing w:after="60"/>
+      </w:pPr>
+      <w:r>
+        <w:rPr>
+          <w:rFonts w:ascii="Calibri" w:hAnsi="Calibri" w:cs="Calibri" w:eastAsia="Calibri"/>
+          <w:b/>
+          <w:color w:val="1F2937"/>
+        </w:rPr>
+        <w:t>Vấn đề:</w:t>
+      </w:r>
+      <w:r>
+        <w:rPr>
+          <w:rFonts w:ascii="Calibri" w:hAnsi="Calibri" w:cs="Calibri" w:eastAsia="Calibri"/>
+          <w:b w:val="0"/>
+          <w:color w:val="1F2937"/>
+        </w:rPr>
+        <w:t xml:space="preserve"> hub </w:t>
+      </w:r>
+      <w:r>
+        <w:rPr>
+          <w:rFonts w:ascii="Calibri" w:hAnsi="Calibri" w:cs="Calibri" w:eastAsia="Calibri"/>
+          <w:b/>
+          <w:color w:val="1F2937"/>
+        </w:rPr>
+        <w:t>giữ</w:t>
+      </w:r>
+      <w:r>
+        <w:rPr>
+          <w:rFonts w:ascii="Calibri" w:hAnsi="Calibri" w:cs="Calibri" w:eastAsia="Calibri"/>
+          <w:b w:val="0"/>
+          <w:color w:val="1F2937"/>
+        </w:rPr>
+        <w:t xml:space="preserve"> máy thí sinh kể cả khi đã offline (logic cũ). Restart hub mới xóa hết; không tiện khi thử nhiều lần.</w:t>
+      </w:r>
+    </w:p>
+    <w:p>
+      <w:pPr>
+        <w:pStyle w:val="ListBullet"/>
+        <w:spacing w:after="60"/>
+      </w:pPr>
+      <w:r>
+        <w:rPr>
+          <w:rFonts w:ascii="Calibri" w:hAnsi="Calibri" w:cs="Calibri" w:eastAsia="Calibri"/>
+          <w:b/>
+          <w:color w:val="1F2937"/>
+        </w:rPr>
+        <w:t>Cách làm:</w:t>
+      </w:r>
+      <w:r>
+        <w:rPr>
+          <w:rFonts w:ascii="Calibri" w:hAnsi="Calibri" w:cs="Calibri" w:eastAsia="Calibri"/>
+          <w:b w:val="0"/>
+          <w:color w:val="1F2937"/>
+        </w:rPr>
+        <w:t xml:space="preserve"> mỗi ô máy có icon thùng rác → xác nhận → gỡ máy khỏi lưới.</w:t>
+      </w:r>
+    </w:p>
+    <w:p>
+      <w:pPr>
+        <w:pStyle w:val="ListBullet"/>
+        <w:spacing w:after="60"/>
+      </w:pPr>
+      <w:r>
+        <w:rPr>
+          <w:rFonts w:ascii="Calibri" w:hAnsi="Calibri" w:cs="Calibri" w:eastAsia="Calibri"/>
+          <w:b/>
+          <w:color w:val="1F2937"/>
+        </w:rPr>
+        <w:t>API:</w:t>
+      </w:r>
+      <w:r>
+        <w:rPr>
+          <w:rFonts w:ascii="Calibri" w:hAnsi="Calibri" w:cs="Calibri" w:eastAsia="Calibri"/>
+          <w:b w:val="0"/>
+          <w:color w:val="1F2937"/>
+        </w:rPr>
+        <w:t xml:space="preserve"> </w:t>
+      </w:r>
+      <w:r>
+        <w:rPr>
+          <w:rFonts w:ascii="Consolas" w:hAnsi="Consolas" w:cs="Consolas" w:eastAsia="Consolas"/>
+          <w:b w:val="0"/>
+          <w:color w:val="9A3412"/>
+          <w:sz w:val="21"/>
+        </w:rPr>
+        <w:t>DELETE /api/stations/{roomId}/{stationId}</w:t>
+      </w:r>
+      <w:r>
+        <w:rPr>
+          <w:rFonts w:ascii="Calibri" w:hAnsi="Calibri" w:cs="Calibri" w:eastAsia="Calibri"/>
+          <w:b w:val="0"/>
+          <w:color w:val="1F2937"/>
+        </w:rPr>
+        <w:t xml:space="preserve"> — </w:t>
+      </w:r>
+      <w:r>
+        <w:rPr>
+          <w:rFonts w:ascii="Calibri" w:hAnsi="Calibri" w:cs="Calibri" w:eastAsia="Calibri"/>
+          <w:b/>
+          <w:color w:val="1F2937"/>
+        </w:rPr>
+        <w:t>chỉ xóa session máy</w:t>
+      </w:r>
+      <w:r>
+        <w:rPr>
+          <w:rFonts w:ascii="Calibri" w:hAnsi="Calibri" w:cs="Calibri" w:eastAsia="Calibri"/>
+          <w:b w:val="0"/>
+          <w:color w:val="1F2937"/>
+        </w:rPr>
+        <w:t xml:space="preserve">, </w:t>
+      </w:r>
+      <w:r>
+        <w:rPr>
+          <w:rFonts w:ascii="Calibri" w:hAnsi="Calibri" w:cs="Calibri" w:eastAsia="Calibri"/>
+          <w:b/>
+          <w:color w:val="1F2937"/>
+        </w:rPr>
+        <w:t>không xóa</w:t>
+      </w:r>
+      <w:r>
+        <w:rPr>
+          <w:rFonts w:ascii="Calibri" w:hAnsi="Calibri" w:cs="Calibri" w:eastAsia="Calibri"/>
+          <w:b w:val="0"/>
+          <w:color w:val="1F2937"/>
+        </w:rPr>
+        <w:t xml:space="preserve"> cảnh báo đã ghi.</w:t>
+      </w:r>
+    </w:p>
+    <w:p>
+      <w:pPr>
+        <w:pStyle w:val="ListBullet"/>
+        <w:spacing w:after="60"/>
+      </w:pPr>
+      <w:r>
+        <w:rPr>
+          <w:rFonts w:ascii="Calibri" w:hAnsi="Calibri" w:cs="Calibri" w:eastAsia="Calibri"/>
+          <w:b/>
+          <w:color w:val="1F2937"/>
+        </w:rPr>
+        <w:t>File:</w:t>
+      </w:r>
+      <w:r>
+        <w:rPr>
+          <w:rFonts w:ascii="Calibri" w:hAnsi="Calibri" w:cs="Calibri" w:eastAsia="Calibri"/>
+          <w:b w:val="0"/>
+          <w:color w:val="1F2937"/>
+        </w:rPr>
+        <w:t xml:space="preserve"> </w:t>
+      </w:r>
+      <w:r>
+        <w:rPr>
+          <w:rFonts w:ascii="Consolas" w:hAnsi="Consolas" w:cs="Consolas" w:eastAsia="Consolas"/>
+          <w:b w:val="0"/>
+          <w:color w:val="9A3412"/>
+          <w:sz w:val="21"/>
+        </w:rPr>
+        <w:t>exam_store.remove_station</w:t>
+      </w:r>
+      <w:r>
+        <w:rPr>
+          <w:rFonts w:ascii="Calibri" w:hAnsi="Calibri" w:cs="Calibri" w:eastAsia="Calibri"/>
+          <w:b w:val="0"/>
+          <w:color w:val="1F2937"/>
+        </w:rPr>
+        <w:t xml:space="preserve">, </w:t>
+      </w:r>
+      <w:r>
+        <w:rPr>
+          <w:rFonts w:ascii="Consolas" w:hAnsi="Consolas" w:cs="Consolas" w:eastAsia="Consolas"/>
+          <w:b w:val="0"/>
+          <w:color w:val="9A3412"/>
+          <w:sz w:val="21"/>
+        </w:rPr>
+        <w:t>http_handler.do_DELETE</w:t>
+      </w:r>
+      <w:r>
+        <w:rPr>
+          <w:rFonts w:ascii="Calibri" w:hAnsi="Calibri" w:cs="Calibri" w:eastAsia="Calibri"/>
+          <w:b w:val="0"/>
+          <w:color w:val="1F2937"/>
+        </w:rPr>
+        <w:t xml:space="preserve">, </w:t>
+      </w:r>
+      <w:r>
+        <w:rPr>
+          <w:rFonts w:ascii="Consolas" w:hAnsi="Consolas" w:cs="Consolas" w:eastAsia="Consolas"/>
+          <w:b w:val="0"/>
+          <w:color w:val="9A3412"/>
+          <w:sz w:val="21"/>
+        </w:rPr>
+        <w:t>station-grid.tsx</w:t>
+      </w:r>
+      <w:r>
+        <w:rPr>
+          <w:rFonts w:ascii="Calibri" w:hAnsi="Calibri" w:cs="Calibri" w:eastAsia="Calibri"/>
+          <w:b w:val="0"/>
+          <w:color w:val="1F2937"/>
+        </w:rPr>
+        <w:t xml:space="preserve">, </w:t>
+      </w:r>
+      <w:r>
+        <w:rPr>
+          <w:rFonts w:ascii="Consolas" w:hAnsi="Consolas" w:cs="Consolas" w:eastAsia="Consolas"/>
+          <w:b w:val="0"/>
+          <w:color w:val="9A3412"/>
+          <w:sz w:val="21"/>
+        </w:rPr>
+        <w:t>removeStation</w:t>
+      </w:r>
+      <w:r>
+        <w:rPr>
+          <w:rFonts w:ascii="Calibri" w:hAnsi="Calibri" w:cs="Calibri" w:eastAsia="Calibri"/>
+          <w:b w:val="0"/>
+          <w:color w:val="1F2937"/>
+        </w:rPr>
+        <w:t xml:space="preserve"> trong </w:t>
+      </w:r>
+      <w:r>
+        <w:rPr>
+          <w:rFonts w:ascii="Consolas" w:hAnsi="Consolas" w:cs="Consolas" w:eastAsia="Consolas"/>
+          <w:b w:val="0"/>
+          <w:color w:val="9A3412"/>
+          <w:sz w:val="21"/>
+        </w:rPr>
+        <w:t>exam-sync.ts</w:t>
+      </w:r>
+      <w:r>
+        <w:rPr>
+          <w:rFonts w:ascii="Calibri" w:hAnsi="Calibri" w:cs="Calibri" w:eastAsia="Calibri"/>
+          <w:b w:val="0"/>
+          <w:color w:val="1F2937"/>
+        </w:rPr>
+        <w:t>.</w:t>
+      </w:r>
+    </w:p>
+    <w:p>
+      <w:pPr>
+        <w:pStyle w:val="Heading2"/>
+      </w:pPr>
+      <w:r>
+        <w:t>6.2. Đồng bộ ngưỡng Quản trị → thí sinh qua hub</w:t>
+      </w:r>
+    </w:p>
+    <w:p>
+      <w:pPr>
+        <w:pStyle w:val="ListBullet"/>
+        <w:spacing w:after="60"/>
+      </w:pPr>
+      <w:r>
+        <w:rPr>
+          <w:rFonts w:ascii="Calibri" w:hAnsi="Calibri" w:cs="Calibri" w:eastAsia="Calibri"/>
+          <w:b w:val="0"/>
+          <w:color w:val="1F2937"/>
+        </w:rPr>
+        <w:t xml:space="preserve">Trước: ngưỡng chỉ nằm localStorage máy mở </w:t>
+      </w:r>
+      <w:r>
+        <w:rPr>
+          <w:rFonts w:ascii="Consolas" w:hAnsi="Consolas" w:cs="Consolas" w:eastAsia="Consolas"/>
+          <w:b w:val="0"/>
+          <w:color w:val="9A3412"/>
+          <w:sz w:val="21"/>
+        </w:rPr>
+        <w:t>/quan-tri</w:t>
+      </w:r>
+      <w:r>
+        <w:rPr>
+          <w:rFonts w:ascii="Calibri" w:hAnsi="Calibri" w:cs="Calibri" w:eastAsia="Calibri"/>
+          <w:b w:val="0"/>
+          <w:color w:val="1F2937"/>
+        </w:rPr>
+        <w:t xml:space="preserve"> → máy thí sinh vẫn hiện 2 giây dù đã sửa thành 5.</w:t>
+      </w:r>
+    </w:p>
+    <w:p>
+      <w:pPr>
+        <w:pStyle w:val="ListBullet"/>
+        <w:spacing w:after="60"/>
+      </w:pPr>
+      <w:r>
+        <w:rPr>
+          <w:rFonts w:ascii="Calibri" w:hAnsi="Calibri" w:cs="Calibri" w:eastAsia="Calibri"/>
+          <w:b w:val="0"/>
+          <w:color w:val="1F2937"/>
+        </w:rPr>
+        <w:t xml:space="preserve">Nay: </w:t>
+      </w:r>
+      <w:r>
+        <w:rPr>
+          <w:rFonts w:ascii="Calibri" w:hAnsi="Calibri" w:cs="Calibri" w:eastAsia="Calibri"/>
+          <w:b/>
+          <w:color w:val="1F2937"/>
+        </w:rPr>
+        <w:t>Lưu thay đổi</w:t>
+      </w:r>
+      <w:r>
+        <w:rPr>
+          <w:rFonts w:ascii="Calibri" w:hAnsi="Calibri" w:cs="Calibri" w:eastAsia="Calibri"/>
+          <w:b w:val="0"/>
+          <w:color w:val="1F2937"/>
+        </w:rPr>
+        <w:t xml:space="preserve"> đẩy </w:t>
+      </w:r>
+      <w:r>
+        <w:rPr>
+          <w:rFonts w:ascii="Consolas" w:hAnsi="Consolas" w:cs="Consolas" w:eastAsia="Consolas"/>
+          <w:b w:val="0"/>
+          <w:color w:val="9A3412"/>
+          <w:sz w:val="21"/>
+        </w:rPr>
+        <w:t>thresholds</w:t>
+      </w:r>
+      <w:r>
+        <w:rPr>
+          <w:rFonts w:ascii="Calibri" w:hAnsi="Calibri" w:cs="Calibri" w:eastAsia="Calibri"/>
+          <w:b w:val="0"/>
+          <w:color w:val="1F2937"/>
+        </w:rPr>
+        <w:t xml:space="preserve"> lên </w:t>
+      </w:r>
+      <w:r>
+        <w:rPr>
+          <w:rFonts w:ascii="Consolas" w:hAnsi="Consolas" w:cs="Consolas" w:eastAsia="Consolas"/>
+          <w:b w:val="0"/>
+          <w:color w:val="9A3412"/>
+          <w:sz w:val="21"/>
+        </w:rPr>
+        <w:t>/api/settings</w:t>
+      </w:r>
+      <w:r>
+        <w:rPr>
+          <w:rFonts w:ascii="Calibri" w:hAnsi="Calibri" w:cs="Calibri" w:eastAsia="Calibri"/>
+          <w:b w:val="0"/>
+          <w:color w:val="1F2937"/>
+        </w:rPr>
+        <w:t>; thí sinh đọc lại (khi bắt đầu và mỗi ~2 giây).</w:t>
+      </w:r>
+    </w:p>
+    <w:p>
+      <w:pPr>
+        <w:pStyle w:val="ListBullet"/>
+        <w:spacing w:after="60"/>
+      </w:pPr>
+      <w:r>
+        <w:rPr>
+          <w:rFonts w:ascii="Calibri" w:hAnsi="Calibri" w:cs="Calibri" w:eastAsia="Calibri"/>
+          <w:b w:val="0"/>
+          <w:color w:val="1F2937"/>
+        </w:rPr>
+        <w:t xml:space="preserve">Demo: đổi “Nhiều khuôn mặt” 2→5 → Lưu → nhìn thanh tiến trình thí sinh thành </w:t>
+      </w:r>
+      <w:r>
+        <w:rPr>
+          <w:rFonts w:ascii="Consolas" w:hAnsi="Consolas" w:cs="Consolas" w:eastAsia="Consolas"/>
+          <w:b w:val="0"/>
+          <w:color w:val="9A3412"/>
+          <w:sz w:val="21"/>
+        </w:rPr>
+        <w:t>… / 5.0s</w:t>
+      </w:r>
+      <w:r>
+        <w:rPr>
+          <w:rFonts w:ascii="Calibri" w:hAnsi="Calibri" w:cs="Calibri" w:eastAsia="Calibri"/>
+          <w:b w:val="0"/>
+          <w:color w:val="1F2937"/>
+        </w:rPr>
+        <w:t>.</w:t>
+      </w:r>
+    </w:p>
+    <w:p>
+      <w:pPr>
+        <w:pStyle w:val="Heading2"/>
+      </w:pPr>
+      <w:r>
+        <w:t>6.3. Gửi cảnh báo ổn định hơn</w:t>
+      </w:r>
+    </w:p>
+    <w:p>
+      <w:pPr>
+        <w:pStyle w:val="ListBullet"/>
+        <w:spacing w:after="60"/>
+      </w:pPr>
+      <w:r>
+        <w:rPr>
+          <w:rFonts w:ascii="Calibri" w:hAnsi="Calibri" w:cs="Calibri" w:eastAsia="Calibri"/>
+          <w:b w:val="0"/>
+          <w:color w:val="1F2937"/>
+        </w:rPr>
+        <w:t>Không lưu clip vào localStorage (tránh đầy bộ nhớ → không gửi được hub).</w:t>
+      </w:r>
+    </w:p>
+    <w:p>
+      <w:pPr>
+        <w:pStyle w:val="ListBullet"/>
+        <w:spacing w:after="60"/>
+      </w:pPr>
+      <w:r>
+        <w:rPr>
+          <w:rFonts w:ascii="Calibri" w:hAnsi="Calibri" w:cs="Calibri" w:eastAsia="Calibri"/>
+          <w:b w:val="0"/>
+          <w:color w:val="1F2937"/>
+        </w:rPr>
+        <w:t>Gửi thẳng hub thành công → báo “Giám thị đã nhận” ngay.</w:t>
+      </w:r>
+    </w:p>
+    <w:p>
+      <w:pPr>
+        <w:pStyle w:val="ListBullet"/>
+        <w:spacing w:after="60"/>
+      </w:pPr>
+      <w:r>
+        <w:rPr>
+          <w:rFonts w:ascii="Calibri" w:hAnsi="Calibri" w:cs="Calibri" w:eastAsia="Calibri"/>
+          <w:b w:val="0"/>
+          <w:color w:val="1F2937"/>
+        </w:rPr>
+        <w:t xml:space="preserve">Hub từ chối một cảnh báo hỏng (4xx) → bỏ mục đó, </w:t>
+      </w:r>
+      <w:r>
+        <w:rPr>
+          <w:rFonts w:ascii="Calibri" w:hAnsi="Calibri" w:cs="Calibri" w:eastAsia="Calibri"/>
+          <w:b/>
+          <w:color w:val="1F2937"/>
+        </w:rPr>
+        <w:t>không kẹt cả hàng</w:t>
+      </w:r>
+      <w:r>
+        <w:rPr>
+          <w:rFonts w:ascii="Calibri" w:hAnsi="Calibri" w:cs="Calibri" w:eastAsia="Calibri"/>
+          <w:b w:val="0"/>
+          <w:color w:val="1F2937"/>
+        </w:rPr>
+        <w:t xml:space="preserve"> hộp thư đi.</w:t>
+      </w:r>
+    </w:p>
+    <w:p>
+      <w:pPr>
+        <w:pStyle w:val="Heading2"/>
+      </w:pPr>
+      <w:r>
+        <w:t>6.4. Dải “Cảnh báo mới cần kiểm tra”</w:t>
+      </w:r>
+    </w:p>
+    <w:p>
+      <w:r>
+        <w:rPr>
+          <w:rFonts w:ascii="Calibri" w:hAnsi="Calibri" w:cs="Calibri" w:eastAsia="Calibri"/>
+          <w:b w:val="0"/>
+          <w:color w:val="1F2937"/>
+        </w:rPr>
+        <w:t xml:space="preserve">Trước: dải đỏ có thể </w:t>
+      </w:r>
+      <w:r>
+        <w:rPr>
+          <w:rFonts w:ascii="Calibri" w:hAnsi="Calibri" w:cs="Calibri" w:eastAsia="Calibri"/>
+          <w:b/>
+          <w:color w:val="1F2937"/>
+        </w:rPr>
+        <w:t>còn trên màn hình</w:t>
+      </w:r>
+      <w:r>
+        <w:rPr>
+          <w:rFonts w:ascii="Calibri" w:hAnsi="Calibri" w:cs="Calibri" w:eastAsia="Calibri"/>
+          <w:b w:val="0"/>
+          <w:color w:val="1F2937"/>
+        </w:rPr>
+        <w:t xml:space="preserve"> dù hub đã reset / không còn cảnh báo. Nay: nếu cảnh báo đó không còn trong danh sách (hoặc đã xem) thì dải đỏ </w:t>
+      </w:r>
+      <w:r>
+        <w:rPr>
+          <w:rFonts w:ascii="Calibri" w:hAnsi="Calibri" w:cs="Calibri" w:eastAsia="Calibri"/>
+          <w:b/>
+          <w:color w:val="1F2937"/>
+        </w:rPr>
+        <w:t>tự tắt</w:t>
+      </w:r>
+      <w:r>
+        <w:rPr>
+          <w:rFonts w:ascii="Calibri" w:hAnsi="Calibri" w:cs="Calibri" w:eastAsia="Calibri"/>
+          <w:b w:val="0"/>
+          <w:color w:val="1F2937"/>
+        </w:rPr>
+        <w:t>.</w:t>
+      </w:r>
+    </w:p>
+    <w:p>
+      <w:pPr>
+        <w:pStyle w:val="Heading2"/>
+      </w:pPr>
+      <w:r>
+        <w:t>6.5. HTTPS khi máy khác mở trang qua LAN</w:t>
+      </w:r>
+    </w:p>
+    <w:p>
+      <w:pPr>
+        <w:pStyle w:val="ListBullet"/>
+        <w:spacing w:after="60"/>
+      </w:pPr>
+      <w:r>
+        <w:rPr>
+          <w:rFonts w:ascii="Calibri" w:hAnsi="Calibri" w:cs="Calibri" w:eastAsia="Calibri"/>
+          <w:b w:val="0"/>
+          <w:color w:val="1F2937"/>
+        </w:rPr>
+        <w:t xml:space="preserve">Webcam trên IP LAN cần </w:t>
+      </w:r>
+      <w:r>
+        <w:rPr>
+          <w:rFonts w:ascii="Calibri" w:hAnsi="Calibri" w:cs="Calibri" w:eastAsia="Calibri"/>
+          <w:b/>
+          <w:color w:val="1F2937"/>
+        </w:rPr>
+        <w:t>HTTPS</w:t>
+      </w:r>
+      <w:r>
+        <w:rPr>
+          <w:rFonts w:ascii="Calibri" w:hAnsi="Calibri" w:cs="Calibri" w:eastAsia="Calibri"/>
+          <w:b w:val="0"/>
+          <w:color w:val="1F2937"/>
+        </w:rPr>
+        <w:t xml:space="preserve"> (</w:t>
+      </w:r>
+      <w:r>
+        <w:rPr>
+          <w:rFonts w:ascii="Consolas" w:hAnsi="Consolas" w:cs="Consolas" w:eastAsia="Consolas"/>
+          <w:b w:val="0"/>
+          <w:color w:val="9A3412"/>
+          <w:sz w:val="21"/>
+        </w:rPr>
+        <w:t>npm run dev:https</w:t>
+      </w:r>
+      <w:r>
+        <w:rPr>
+          <w:rFonts w:ascii="Calibri" w:hAnsi="Calibri" w:cs="Calibri" w:eastAsia="Calibri"/>
+          <w:b w:val="0"/>
+          <w:color w:val="1F2937"/>
+        </w:rPr>
+        <w:t>).</w:t>
+      </w:r>
+    </w:p>
+    <w:p>
+      <w:pPr>
+        <w:pStyle w:val="ListBullet"/>
+        <w:spacing w:after="60"/>
+      </w:pPr>
+      <w:r>
+        <w:rPr>
+          <w:rFonts w:ascii="Calibri" w:hAnsi="Calibri" w:cs="Calibri" w:eastAsia="Calibri"/>
+          <w:b w:val="0"/>
+          <w:color w:val="1F2937"/>
+        </w:rPr>
+        <w:t xml:space="preserve">Cert tự ký phải khớp IP máy hiện tại; đổi Wi‑Fi thì chạy </w:t>
+      </w:r>
+      <w:r>
+        <w:rPr>
+          <w:rFonts w:ascii="Consolas" w:hAnsi="Consolas" w:cs="Consolas" w:eastAsia="Consolas"/>
+          <w:b w:val="0"/>
+          <w:color w:val="9A3412"/>
+          <w:sz w:val="21"/>
+        </w:rPr>
+        <w:t>npm run certs:dev</w:t>
+      </w:r>
+      <w:r>
+        <w:rPr>
+          <w:rFonts w:ascii="Calibri" w:hAnsi="Calibri" w:cs="Calibri" w:eastAsia="Calibri"/>
+          <w:b w:val="0"/>
+          <w:color w:val="1F2937"/>
+        </w:rPr>
+        <w:t xml:space="preserve"> rồi mở lại </w:t>
+      </w:r>
+      <w:r>
+        <w:rPr>
+          <w:rFonts w:ascii="Consolas" w:hAnsi="Consolas" w:cs="Consolas" w:eastAsia="Consolas"/>
+          <w:b w:val="0"/>
+          <w:color w:val="9A3412"/>
+          <w:sz w:val="21"/>
+        </w:rPr>
+        <w:t>dev:https</w:t>
+      </w:r>
+      <w:r>
+        <w:rPr>
+          <w:rFonts w:ascii="Calibri" w:hAnsi="Calibri" w:cs="Calibri" w:eastAsia="Calibri"/>
+          <w:b w:val="0"/>
+          <w:color w:val="1F2937"/>
+        </w:rPr>
+        <w:t>.</w:t>
+      </w:r>
+    </w:p>
+    <w:p>
+      <w:pPr>
+        <w:pStyle w:val="ListBullet"/>
+        <w:spacing w:after="60"/>
+      </w:pPr>
+      <w:r>
+        <w:rPr>
+          <w:rFonts w:ascii="Calibri" w:hAnsi="Calibri" w:cs="Calibri" w:eastAsia="Calibri"/>
+          <w:b w:val="0"/>
+          <w:color w:val="1F2937"/>
+        </w:rPr>
+        <w:t xml:space="preserve">Máy khác: mở </w:t>
+      </w:r>
+      <w:r>
+        <w:rPr>
+          <w:rFonts w:ascii="Consolas" w:hAnsi="Consolas" w:cs="Consolas" w:eastAsia="Consolas"/>
+          <w:b w:val="0"/>
+          <w:color w:val="9A3412"/>
+          <w:sz w:val="21"/>
+        </w:rPr>
+        <w:t>https://&lt;IP&gt;:3000</w:t>
+      </w:r>
+      <w:r>
+        <w:rPr>
+          <w:rFonts w:ascii="Calibri" w:hAnsi="Calibri" w:cs="Calibri" w:eastAsia="Calibri"/>
+          <w:b w:val="0"/>
+          <w:color w:val="1F2937"/>
+        </w:rPr>
+        <w:t xml:space="preserve"> → Advanced → Proceed (cert tự ký là bình thường).</w:t>
+      </w:r>
+    </w:p>
+    <w:p>
+      <w:pPr>
+        <w:pStyle w:val="ListBullet"/>
+        <w:spacing w:after="60"/>
+      </w:pPr>
+      <w:r>
+        <w:rPr>
+          <w:rFonts w:ascii="Calibri" w:hAnsi="Calibri" w:cs="Calibri" w:eastAsia="Calibri"/>
+          <w:b w:val="0"/>
+          <w:color w:val="1F2937"/>
+        </w:rPr>
+        <w:t xml:space="preserve">Hub Python </w:t>
+      </w:r>
+      <w:r>
+        <w:rPr>
+          <w:rFonts w:ascii="Consolas" w:hAnsi="Consolas" w:cs="Consolas" w:eastAsia="Consolas"/>
+          <w:b w:val="0"/>
+          <w:color w:val="9A3412"/>
+          <w:sz w:val="21"/>
+        </w:rPr>
+        <w:t>:8765</w:t>
+      </w:r>
+      <w:r>
+        <w:rPr>
+          <w:rFonts w:ascii="Calibri" w:hAnsi="Calibri" w:cs="Calibri" w:eastAsia="Calibri"/>
+          <w:b w:val="0"/>
+          <w:color w:val="1F2937"/>
+        </w:rPr>
+        <w:t xml:space="preserve"> phải chạy cùng lúc, vì Next proxy </w:t>
+      </w:r>
+      <w:r>
+        <w:rPr>
+          <w:rFonts w:ascii="Consolas" w:hAnsi="Consolas" w:cs="Consolas" w:eastAsia="Consolas"/>
+          <w:b w:val="0"/>
+          <w:color w:val="9A3412"/>
+          <w:sz w:val="21"/>
+        </w:rPr>
+        <w:t>/api</w:t>
+      </w:r>
+      <w:r>
+        <w:rPr>
+          <w:rFonts w:ascii="Calibri" w:hAnsi="Calibri" w:cs="Calibri" w:eastAsia="Calibri"/>
+          <w:b w:val="0"/>
+          <w:color w:val="1F2937"/>
+        </w:rPr>
+        <w:t xml:space="preserve"> sang hub.</w:t>
+      </w:r>
+    </w:p>
+    <w:p>
+      <w:r>
+        <w:br w:type="page"/>
+      </w:r>
+    </w:p>
+    <w:p>
+      <w:pPr>
+        <w:pStyle w:val="Heading1"/>
+      </w:pPr>
+      <w:r>
+        <w:t>7. Cải tiến 4 — Buổi thử thật với thầy cô (không phải code)</w:t>
       </w:r>
     </w:p>
     <w:p>
@@ -9087,7 +10314,7 @@
         <w:pStyle w:val="Heading1"/>
       </w:pPr>
       <w:r>
-        <w:t>7. Việc đã gỡ: cảnh báo bằng âm thanh</w:t>
+        <w:t>8. Việc đã gỡ: cảnh báo bằng âm thanh</w:t>
       </w:r>
     </w:p>
     <w:p>
@@ -9281,7 +10508,7 @@
         <w:pStyle w:val="Heading1"/>
       </w:pPr>
       <w:r>
-        <w:t>8. Đường dự phòng thuật toán nhìn (vision-provider) — trả lời câu hỏi sâu</w:t>
+        <w:t>9. Đường dự phòng thuật toán nhìn (vision-provider) — trả lời câu hỏi sâu</w:t>
       </w:r>
     </w:p>
     <w:p>
@@ -9659,7 +10886,7 @@
         <w:pStyle w:val="Heading1"/>
       </w:pPr>
       <w:r>
-        <w:t>9. Bản đồ file cải tiến (học thuộc cột “nói một câu”)</w:t>
+        <w:t>10. Bản đồ file cải tiến (học thuộc cột “nói một câu”)</w:t>
       </w:r>
     </w:p>
     <w:p>
@@ -9893,7 +11120,7 @@
                 <w:color w:val="1F2937"/>
                 <w:sz w:val="18"/>
               </w:rPr>
-              <w:t>“Hợp đồng web–Python: verdicts, giới hạn dung lượng gửi.”</w:t>
+              <w:t>“Hợp đồng web–Python: verdicts, giới hạn dung lượng, API xóa máy.”</w:t>
             </w:r>
           </w:p>
         </w:tc>
@@ -9957,7 +11184,7 @@
                 <w:color w:val="1F2937"/>
                 <w:sz w:val="18"/>
               </w:rPr>
-              <w:t>“Hub lưu cảnh báo + kết luận + cài đặt lưu đoạn hình trong RAM.”</w:t>
+              <w:t>“Hub lưu cảnh báo + kết luận + cài đặt (ngưỡng, clip) trong RAM; có xóa máy.”</w:t>
             </w:r>
           </w:p>
         </w:tc>
@@ -10023,7 +11250,7 @@
                 <w:color w:val="1F2937"/>
                 <w:sz w:val="18"/>
               </w:rPr>
-              <w:t>“API nhận PATCH verdict và GET/POST settings.”</w:t>
+              <w:t>“API PATCH verdict, GET/POST settings, DELETE máy.”</w:t>
             </w:r>
           </w:p>
         </w:tc>
@@ -10347,7 +11574,7 @@
                 <w:color w:val="1F2937"/>
                 <w:sz w:val="18"/>
               </w:rPr>
-              <w:t>“Bộ não phiên thí sinh: AI, clip, gửi cảnh báo.”</w:t>
+              <w:t>“Bộ não phiên thí sinh: AI, clip, đọc ngưỡng từ hub.”</w:t>
             </w:r>
           </w:p>
         </w:tc>
@@ -10446,6 +11673,71 @@
                 <w:color w:val="9A3412"/>
                 <w:sz w:val="16"/>
               </w:rPr>
+              <w:t>web/src/features/proctor/components/station-grid.tsx</w:t>
+            </w:r>
+          </w:p>
+        </w:tc>
+        <w:tc>
+          <w:tcPr>
+            <w:tcW w:type="dxa" w:w="6293"/>
+            <w:tcBorders>
+              <w:top w:val="single" w:sz="4" w:color="D5DDE8"/>
+              <w:left w:val="single" w:sz="4" w:color="D5DDE8"/>
+              <w:bottom w:val="single" w:sz="4" w:color="D5DDE8"/>
+              <w:right w:val="single" w:sz="4" w:color="D5DDE8"/>
+            </w:tcBorders>
+            <w:tcMar>
+              <w:top w:w="60" w:type="dxa"/>
+              <w:left w:w="100" w:type="dxa"/>
+              <w:bottom w:w="60" w:type="dxa"/>
+              <w:right w:w="100" w:type="dxa"/>
+            </w:tcMar>
+          </w:tcPr>
+          <w:p>
+            <w:pPr>
+              <w:spacing w:after="0" w:line="264" w:lineRule="auto"/>
+            </w:pPr>
+            <w:r>
+              <w:rPr>
+                <w:rFonts w:ascii="Calibri" w:hAnsi="Calibri" w:cs="Calibri" w:eastAsia="Calibri"/>
+                <w:b w:val="0"/>
+                <w:color w:val="1F2937"/>
+                <w:sz w:val="18"/>
+              </w:rPr>
+              <w:t>“Lưới máy + nút thùng rác xóa máy offline.”</w:t>
+            </w:r>
+          </w:p>
+        </w:tc>
+      </w:tr>
+      <w:tr>
+        <w:tc>
+          <w:tcPr>
+            <w:tcW w:type="dxa" w:w="3118"/>
+            <w:tcBorders>
+              <w:top w:val="single" w:sz="4" w:color="D5DDE8"/>
+              <w:left w:val="single" w:sz="4" w:color="D5DDE8"/>
+              <w:bottom w:val="single" w:sz="4" w:color="D5DDE8"/>
+              <w:right w:val="single" w:sz="4" w:color="D5DDE8"/>
+            </w:tcBorders>
+            <w:tcMar>
+              <w:top w:w="60" w:type="dxa"/>
+              <w:left w:w="100" w:type="dxa"/>
+              <w:bottom w:w="60" w:type="dxa"/>
+              <w:right w:w="100" w:type="dxa"/>
+            </w:tcMar>
+            <w:shd w:val="clear" w:color="auto" w:fill="F8FAFC"/>
+          </w:tcPr>
+          <w:p>
+            <w:pPr>
+              <w:spacing w:after="0" w:line="264" w:lineRule="auto"/>
+            </w:pPr>
+            <w:r>
+              <w:rPr>
+                <w:rFonts w:ascii="Consolas" w:hAnsi="Consolas" w:cs="Consolas" w:eastAsia="Consolas"/>
+                <w:b w:val="0"/>
+                <w:color w:val="9A3412"/>
+                <w:sz w:val="16"/>
+              </w:rPr>
               <w:t>web/src/features/proctor/components/stat-cards.tsx</w:t>
             </w:r>
           </w:p>
@@ -10465,6 +11757,7 @@
               <w:bottom w:w="60" w:type="dxa"/>
               <w:right w:w="100" w:type="dxa"/>
             </w:tcMar>
+            <w:shd w:val="clear" w:color="auto" w:fill="F8FAFC"/>
           </w:tcPr>
           <w:p>
             <w:pPr>
@@ -10498,7 +11791,6 @@
               <w:bottom w:w="60" w:type="dxa"/>
               <w:right w:w="100" w:type="dxa"/>
             </w:tcMar>
-            <w:shd w:val="clear" w:color="auto" w:fill="F8FAFC"/>
           </w:tcPr>
           <w:p>
             <w:pPr>
@@ -10530,7 +11822,6 @@
               <w:bottom w:w="60" w:type="dxa"/>
               <w:right w:w="100" w:type="dxa"/>
             </w:tcMar>
-            <w:shd w:val="clear" w:color="auto" w:fill="F8FAFC"/>
           </w:tcPr>
           <w:p>
             <w:pPr>
@@ -10543,7 +11834,7 @@
                 <w:color w:val="1F2937"/>
                 <w:sz w:val="18"/>
               </w:rPr>
-              <w:t>“Biên bản chỉ lần xác nhận đúng.”</w:t>
+              <w:t>“Biên bản gồm Xác nhận đúng và Báo nhầm.”</w:t>
             </w:r>
           </w:p>
         </w:tc>
@@ -10564,6 +11855,7 @@
               <w:bottom w:w="60" w:type="dxa"/>
               <w:right w:w="100" w:type="dxa"/>
             </w:tcMar>
+            <w:shd w:val="clear" w:color="auto" w:fill="F8FAFC"/>
           </w:tcPr>
           <w:p>
             <w:pPr>
@@ -10595,6 +11887,7 @@
               <w:bottom w:w="60" w:type="dxa"/>
               <w:right w:w="100" w:type="dxa"/>
             </w:tcMar>
+            <w:shd w:val="clear" w:color="auto" w:fill="F8FAFC"/>
           </w:tcPr>
           <w:p>
             <w:pPr>
@@ -10628,7 +11921,6 @@
               <w:bottom w:w="60" w:type="dxa"/>
               <w:right w:w="100" w:type="dxa"/>
             </w:tcMar>
-            <w:shd w:val="clear" w:color="auto" w:fill="F8FAFC"/>
           </w:tcPr>
           <w:p>
             <w:pPr>
@@ -10660,7 +11952,6 @@
               <w:bottom w:w="60" w:type="dxa"/>
               <w:right w:w="100" w:type="dxa"/>
             </w:tcMar>
-            <w:shd w:val="clear" w:color="auto" w:fill="F8FAFC"/>
           </w:tcPr>
           <w:p>
             <w:pPr>
@@ -10673,7 +11964,7 @@
                 <w:color w:val="1F2937"/>
                 <w:sz w:val="18"/>
               </w:rPr>
-              <w:t>“Đẩy/đọc công tắc lưu hình qua hub cho cả phòng.”</w:t>
+              <w:t>“Đẩy/đọc ngưỡng + công tắc lưu hình qua hub.”</w:t>
             </w:r>
           </w:p>
         </w:tc>
@@ -10694,6 +11985,7 @@
               <w:bottom w:w="60" w:type="dxa"/>
               <w:right w:w="100" w:type="dxa"/>
             </w:tcMar>
+            <w:shd w:val="clear" w:color="auto" w:fill="F8FAFC"/>
           </w:tcPr>
           <w:p>
             <w:pPr>
@@ -10725,6 +12017,7 @@
               <w:bottom w:w="60" w:type="dxa"/>
               <w:right w:w="100" w:type="dxa"/>
             </w:tcMar>
+            <w:shd w:val="clear" w:color="auto" w:fill="F8FAFC"/>
           </w:tcPr>
           <w:p>
             <w:pPr>
@@ -10737,7 +12030,7 @@
                 <w:color w:val="1F2937"/>
                 <w:sz w:val="18"/>
               </w:rPr>
-              <w:t>“Gửi cảnh báo; clip gửi thẳng tránh mất trong hộp thư đi.”</w:t>
+              <w:t>“Gửi cảnh báo; clip không nhét localStorage; xóa máy.”</w:t>
             </w:r>
           </w:p>
         </w:tc>
@@ -10758,7 +12051,7 @@
         <w:pStyle w:val="Heading1"/>
       </w:pPr>
       <w:r>
-        <w:t>10. Kịch bản demo vấn đáp (5–7 phút)</w:t>
+        <w:t>11. Kịch bản demo vấn đáp (5–8 phút)</w:t>
       </w:r>
     </w:p>
     <w:p>
@@ -10876,7 +12169,23 @@
           <w:b w:val="0"/>
           <w:color w:val="1F2937"/>
         </w:rPr>
-        <w:t>Giải thích ngưỡng: cúi/ngẩng 6 giây vs quay đầu 3 giây; chỉ bảng số lần 1 → chỉnh → lần 2.</w:t>
+        <w:t xml:space="preserve">Xuất </w:t>
+      </w:r>
+      <w:r>
+        <w:rPr>
+          <w:rFonts w:ascii="Calibri" w:hAnsi="Calibri" w:cs="Calibri" w:eastAsia="Calibri"/>
+          <w:b/>
+          <w:color w:val="1F2937"/>
+        </w:rPr>
+        <w:t>Biên bản đã xác nhận</w:t>
+      </w:r>
+      <w:r>
+        <w:rPr>
+          <w:rFonts w:ascii="Calibri" w:hAnsi="Calibri" w:cs="Calibri" w:eastAsia="Calibri"/>
+          <w:b w:val="0"/>
+          <w:color w:val="1F2937"/>
+        </w:rPr>
+        <w:t>: chỉ rõ file có cả dòng Xác nhận đúng và Báo nhầm.</w:t>
       </w:r>
     </w:p>
     <w:p>
@@ -10899,7 +12208,7 @@
           <w:b w:val="0"/>
           <w:color w:val="1F2937"/>
         </w:rPr>
-        <w:t>Nói quyền riêng tư + buổi thử thầy cô + 1 ý đã sửa theo góp ý (nếu có).</w:t>
+        <w:t>Giải thích ngưỡng: cúi/ngẩng 6 giây vs quay đầu 3 giây; demo Lưu Quản trị → thí sinh đổi số giây.</w:t>
       </w:r>
     </w:p>
     <w:p>
@@ -10922,7 +12231,53 @@
           <w:b w:val="0"/>
           <w:color w:val="1F2937"/>
         </w:rPr>
-        <w:t>Chốt sẵn 3 câu: “AI không kết luận gian lận.” / “future-custom là ổ cắm trống.” / “Clip gắn lúc AI cảnh báo, không lúc bấm xác nhận.”</w:t>
+        <w:t>Demo nút xóa máy offline trên lưới (nếu có máy xám).</w:t>
+      </w:r>
+    </w:p>
+    <w:p>
+      <w:pPr>
+        <w:spacing w:after="80"/>
+        <w:ind w:left="510" w:hanging="510"/>
+      </w:pPr>
+      <w:r>
+        <w:rPr>
+          <w:rFonts w:ascii="Calibri" w:hAnsi="Calibri" w:cs="Calibri" w:eastAsia="Calibri"/>
+          <w:b/>
+          <w:color w:val="2E74B5"/>
+        </w:rPr>
+        <w:t>7.</w:t>
+        <w:tab/>
+      </w:r>
+      <w:r>
+        <w:rPr>
+          <w:rFonts w:ascii="Calibri" w:hAnsi="Calibri" w:cs="Calibri" w:eastAsia="Calibri"/>
+          <w:b w:val="0"/>
+          <w:color w:val="1F2937"/>
+        </w:rPr>
+        <w:t>Nói quyền riêng tư + buổi thử thầy cô + 1 ý đã sửa theo góp ý (nếu có).</w:t>
+      </w:r>
+    </w:p>
+    <w:p>
+      <w:pPr>
+        <w:spacing w:after="80"/>
+        <w:ind w:left="510" w:hanging="510"/>
+      </w:pPr>
+      <w:r>
+        <w:rPr>
+          <w:rFonts w:ascii="Calibri" w:hAnsi="Calibri" w:cs="Calibri" w:eastAsia="Calibri"/>
+          <w:b/>
+          <w:color w:val="2E74B5"/>
+        </w:rPr>
+        <w:t>8.</w:t>
+        <w:tab/>
+      </w:r>
+      <w:r>
+        <w:rPr>
+          <w:rFonts w:ascii="Calibri" w:hAnsi="Calibri" w:cs="Calibri" w:eastAsia="Calibri"/>
+          <w:b w:val="0"/>
+          <w:color w:val="1F2937"/>
+        </w:rPr>
+        <w:t>Chốt: “AI không kết luận gian lận.” / “future-custom là ổ cắm trống.” / “Clip gắn lúc AI cảnh báo.”</w:t>
       </w:r>
     </w:p>
     <w:p>
@@ -10935,7 +12290,7 @@
         <w:pStyle w:val="Heading1"/>
       </w:pPr>
       <w:r>
-        <w:t>11. Ngân hàng câu hỏi khó (học trả lời)</w:t>
+        <w:t>12. Ngân hàng câu hỏi khó (học trả lời)</w:t>
       </w:r>
     </w:p>
     <w:p>
@@ -11223,7 +12578,7 @@
           <w:color w:val="1F2937"/>
           <w:sz w:val="23"/>
         </w:rPr>
-        <w:t>Clip tạo khi AI cảnh báo (nếu bật công tắc), nằm RAM máy giám thị trong dữ liệu cảnh báo. Bấm xác nhận chỉ gắn nhãn đúng/nhầm, không quay thêm.</w:t>
+        <w:t>Clip tạo khi AI cảnh báo (nếu bật công tắc), nằm RAM máy giám thị trong dữ liệu cảnh báo. Bấm xác nhận / báo nhầm chỉ gắn nhãn, không quay thêm.</w:t>
       </w:r>
     </w:p>
     <w:p>
@@ -11367,7 +12722,25 @@
           <w:color w:val="1F2937"/>
           <w:sz w:val="23"/>
         </w:rPr>
-        <w:t>Chỉ cảnh báo giám thị đã bấm Xác nhận đúng. Không gồm báo nhầm và chưa kiểm tra.</w:t>
+        <w:t xml:space="preserve">Các cảnh báo giám thị đã kết luận: Xác nhận đúng </w:t>
+      </w:r>
+      <w:r>
+        <w:rPr>
+          <w:rFonts w:ascii="Calibri" w:hAnsi="Calibri" w:cs="Calibri" w:eastAsia="Calibri"/>
+          <w:b/>
+          <w:color w:val="1F2937"/>
+          <w:sz w:val="23"/>
+        </w:rPr>
+        <w:t>và</w:t>
+      </w:r>
+      <w:r>
+        <w:rPr>
+          <w:rFonts w:ascii="Calibri" w:hAnsi="Calibri" w:cs="Calibri" w:eastAsia="Calibri"/>
+          <w:b w:val="0"/>
+          <w:color w:val="1F2937"/>
+          <w:sz w:val="23"/>
+        </w:rPr>
+        <w:t xml:space="preserve"> Báo nhầm. Cột Kết luận ghi rõ loại nào. Không gồm cảnh báo chưa bấm nút.</w:t>
       </w:r>
     </w:p>
     <w:p>
@@ -11391,7 +12764,7 @@
           <w:color w:val="0B2545"/>
           <w:sz w:val="24"/>
         </w:rPr>
-        <w:t>Vì sao bỏ tiếng bíp?</w:t>
+        <w:t>Chỉnh ngưỡng ở Quản trị mà thí sinh không đổi — vì sao?</w:t>
       </w:r>
     </w:p>
     <w:p>
@@ -11415,7 +12788,7 @@
           <w:color w:val="1F2937"/>
           <w:sz w:val="23"/>
         </w:rPr>
-        <w:t>Ưu tiên tín hiệu nhìn thấy, tránh ồn khi trình diễn/thử; vẫn còn dải cảnh báo mới và màu máy.</w:t>
+        <w:t>Phải bấm Lưu thay đổi để đẩy lên hub; hub phải chạy; thí sinh đọc lại từ hub. Chỉ gõ số mà không Lưu thì máy kia không biết.</w:t>
       </w:r>
     </w:p>
     <w:p>
@@ -11439,7 +12812,7 @@
           <w:color w:val="0B2545"/>
           <w:sz w:val="24"/>
         </w:rPr>
-        <w:t>Em làm phần nào trong nhóm?</w:t>
+        <w:t>Nút xóa máy làm gì? Có xóa cảnh báo không?</w:t>
       </w:r>
     </w:p>
     <w:p>
@@ -11463,25 +12836,7 @@
           <w:color w:val="1F2937"/>
           <w:sz w:val="23"/>
         </w:rPr>
-        <w:t xml:space="preserve">Có thể nói mình góp sức chỗ nào (code / thử số / buổi thầy cô), nhưng </w:t>
-      </w:r>
-      <w:r>
-        <w:rPr>
-          <w:rFonts w:ascii="Calibri" w:hAnsi="Calibri" w:cs="Calibri" w:eastAsia="Calibri"/>
-          <w:b/>
-          <w:color w:val="1F2937"/>
-          <w:sz w:val="23"/>
-        </w:rPr>
-        <w:t>vẫn phải giải thích được cả bốn cải tiến</w:t>
-      </w:r>
-      <w:r>
-        <w:rPr>
-          <w:rFonts w:ascii="Calibri" w:hAnsi="Calibri" w:cs="Calibri" w:eastAsia="Calibri"/>
-          <w:b w:val="0"/>
-          <w:color w:val="1F2937"/>
-          <w:sz w:val="23"/>
-        </w:rPr>
-        <w:t>. Không được bảo “phần đó bạn kia phụ trách nên em không biết”.</w:t>
+        <w:t>Gỡ máy khỏi lưới giám thị (session offline / thử nghiệm cũ). Không xóa các cảnh báo đã ghi của máy đó.</w:t>
       </w:r>
     </w:p>
     <w:p>
@@ -11505,7 +12860,7 @@
           <w:color w:val="0B2545"/>
           <w:sz w:val="24"/>
         </w:rPr>
-        <w:t>Nếu chỉnh ngưỡng xong báo nhầm giảm nhưng bỏ sót tăng?</w:t>
+        <w:t>Vì sao bỏ tiếng bíp?</w:t>
       </w:r>
     </w:p>
     <w:p>
@@ -11529,6 +12884,120 @@
           <w:color w:val="1F2937"/>
           <w:sz w:val="23"/>
         </w:rPr>
+        <w:t>Ưu tiên tín hiệu nhìn thấy, tránh ồn khi trình diễn/thử; vẫn còn dải cảnh báo mới và màu máy.</w:t>
+      </w:r>
+    </w:p>
+    <w:p>
+      <w:pPr>
+        <w:keepNext/>
+        <w:spacing w:before="160" w:after="40"/>
+      </w:pPr>
+      <w:r>
+        <w:rPr>
+          <w:rFonts w:ascii="Calibri" w:hAnsi="Calibri" w:cs="Calibri" w:eastAsia="Calibri"/>
+          <w:b/>
+          <w:color w:val="2E74B5"/>
+          <w:sz w:val="24"/>
+        </w:rPr>
+        <w:t xml:space="preserve">Câu 13. </w:t>
+      </w:r>
+      <w:r>
+        <w:rPr>
+          <w:rFonts w:ascii="Calibri" w:hAnsi="Calibri" w:cs="Calibri" w:eastAsia="Calibri"/>
+          <w:b/>
+          <w:color w:val="0B2545"/>
+          <w:sz w:val="24"/>
+        </w:rPr>
+        <w:t>Em làm phần nào trong nhóm?</w:t>
+      </w:r>
+    </w:p>
+    <w:p>
+      <w:pPr>
+        <w:spacing w:after="40"/>
+        <w:ind w:left="340"/>
+      </w:pPr>
+      <w:r>
+        <w:rPr>
+          <w:rFonts w:ascii="Calibri" w:hAnsi="Calibri" w:cs="Calibri" w:eastAsia="Calibri"/>
+          <w:b/>
+          <w:color w:val="16794A"/>
+          <w:sz w:val="23"/>
+        </w:rPr>
+        <w:t xml:space="preserve">Trả lời: </w:t>
+      </w:r>
+      <w:r>
+        <w:rPr>
+          <w:rFonts w:ascii="Calibri" w:hAnsi="Calibri" w:cs="Calibri" w:eastAsia="Calibri"/>
+          <w:b w:val="0"/>
+          <w:color w:val="1F2937"/>
+          <w:sz w:val="23"/>
+        </w:rPr>
+        <w:t xml:space="preserve">Có thể nói mình góp sức chỗ nào (code / thử số / buổi thầy cô), nhưng </w:t>
+      </w:r>
+      <w:r>
+        <w:rPr>
+          <w:rFonts w:ascii="Calibri" w:hAnsi="Calibri" w:cs="Calibri" w:eastAsia="Calibri"/>
+          <w:b/>
+          <w:color w:val="1F2937"/>
+          <w:sz w:val="23"/>
+        </w:rPr>
+        <w:t>vẫn phải giải thích được cả bốn cải tiến</w:t>
+      </w:r>
+      <w:r>
+        <w:rPr>
+          <w:rFonts w:ascii="Calibri" w:hAnsi="Calibri" w:cs="Calibri" w:eastAsia="Calibri"/>
+          <w:b w:val="0"/>
+          <w:color w:val="1F2937"/>
+          <w:sz w:val="23"/>
+        </w:rPr>
+        <w:t>. Không được bảo “phần đó bạn kia phụ trách nên em không biết”.</w:t>
+      </w:r>
+    </w:p>
+    <w:p>
+      <w:pPr>
+        <w:keepNext/>
+        <w:spacing w:before="160" w:after="40"/>
+      </w:pPr>
+      <w:r>
+        <w:rPr>
+          <w:rFonts w:ascii="Calibri" w:hAnsi="Calibri" w:cs="Calibri" w:eastAsia="Calibri"/>
+          <w:b/>
+          <w:color w:val="2E74B5"/>
+          <w:sz w:val="24"/>
+        </w:rPr>
+        <w:t xml:space="preserve">Câu 14. </w:t>
+      </w:r>
+      <w:r>
+        <w:rPr>
+          <w:rFonts w:ascii="Calibri" w:hAnsi="Calibri" w:cs="Calibri" w:eastAsia="Calibri"/>
+          <w:b/>
+          <w:color w:val="0B2545"/>
+          <w:sz w:val="24"/>
+        </w:rPr>
+        <w:t>Nếu chỉnh ngưỡng xong báo nhầm giảm nhưng bỏ sót tăng?</w:t>
+      </w:r>
+    </w:p>
+    <w:p>
+      <w:pPr>
+        <w:spacing w:after="40"/>
+        <w:ind w:left="340"/>
+      </w:pPr>
+      <w:r>
+        <w:rPr>
+          <w:rFonts w:ascii="Calibri" w:hAnsi="Calibri" w:cs="Calibri" w:eastAsia="Calibri"/>
+          <w:b/>
+          <w:color w:val="16794A"/>
+          <w:sz w:val="23"/>
+        </w:rPr>
+        <w:t xml:space="preserve">Trả lời: </w:t>
+      </w:r>
+      <w:r>
+        <w:rPr>
+          <w:rFonts w:ascii="Calibri" w:hAnsi="Calibri" w:cs="Calibri" w:eastAsia="Calibri"/>
+          <w:b w:val="0"/>
+          <w:color w:val="1F2937"/>
+          <w:sz w:val="23"/>
+        </w:rPr>
         <w:t>Ghi đúng số và giải thích đánh đổi. Giám khảo thích sự trung thực hơn bảng số “đẹp giả”.</w:t>
       </w:r>
     </w:p>
@@ -11542,7 +13011,7 @@
         <w:pStyle w:val="Heading1"/>
       </w:pPr>
       <w:r>
-        <w:t>12. Checklist nộp / trước giờ vấn đáp</w:t>
+        <w:t>13. Checklist nộp / trước giờ vấn đáp</w:t>
       </w:r>
     </w:p>
     <w:p>
@@ -11572,7 +13041,7 @@
           <w:b w:val="0"/>
           <w:color w:val="1F2937"/>
         </w:rPr>
-        <w:t xml:space="preserve"> trong khoảng 2 phút, không nhìn giấy.</w:t>
+        <w:t xml:space="preserve"> (+ vài ý vận hành mục 6) trong khoảng 2–3 phút, không nhìn giấy.</w:t>
       </w:r>
     </w:p>
     <w:p>
@@ -11586,7 +13055,35 @@
           <w:b w:val="0"/>
           <w:color w:val="1F2937"/>
         </w:rPr>
-        <w:t>☐ Mỗi bạn tự demo được: Báo nhầm → số tăng; (nếu có) Play đoạn hình; Biên bản đã xác nhận.</w:t>
+        <w:t>☐ Mỗi bạn tự demo được: Báo nhầm → số tăng; (nếu có) Play đoạn hình; Biên bản có cả đúng và báo nhầm.</w:t>
+      </w:r>
+    </w:p>
+    <w:p>
+      <w:pPr>
+        <w:pStyle w:val="ListBullet"/>
+        <w:spacing w:after="60"/>
+      </w:pPr>
+      <w:r>
+        <w:rPr>
+          <w:rFonts w:ascii="Calibri" w:hAnsi="Calibri" w:cs="Calibri" w:eastAsia="Calibri"/>
+          <w:b w:val="0"/>
+          <w:color w:val="1F2937"/>
+        </w:rPr>
+        <w:t>☐ Demo được: Lưu ngưỡng ở Quản trị → thí sinh đổi số giây.</w:t>
+      </w:r>
+    </w:p>
+    <w:p>
+      <w:pPr>
+        <w:pStyle w:val="ListBullet"/>
+        <w:spacing w:after="60"/>
+      </w:pPr>
+      <w:r>
+        <w:rPr>
+          <w:rFonts w:ascii="Calibri" w:hAnsi="Calibri" w:cs="Calibri" w:eastAsia="Calibri"/>
+          <w:b w:val="0"/>
+          <w:color w:val="1F2937"/>
+        </w:rPr>
+        <w:t>☐ Biết nút xóa máy trên lưới giám thị.</w:t>
       </w:r>
     </w:p>
     <w:p>

</xml_diff>